<commit_message>
Shorten control work answers to essentials
Keep key definitions and lists, reduce verbose explanations
in Kontrolnaya_otvety_varianty_1-4.docx.

Co-authored-by: MaxChicago <MaxChicago@users.noreply.github.com>
</commit_message>
<xml_diff>
--- a/Kontrolnaya_otvety_varianty_1-4.docx
+++ b/Kontrolnaya_otvety_varianty_1-4.docx
@@ -4,14 +4,13 @@
   <w:body>
     <w:p>
       <w:pPr>
-        <w:spacing w:after="120" w:before="0"/>
+        <w:spacing w:after="80"/>
         <w:jc w:val="center"/>
       </w:pPr>
       <w:r>
         <w:rPr>
           <w:rFonts w:ascii="Times New Roman" w:hAnsi="Times New Roman" w:eastAsia="Times New Roman"/>
           <w:b/>
-          <w:i w:val="0"/>
           <w:sz w:val="28"/>
         </w:rPr>
         <w:t>УО «Минский государственный механико-технологический колледж»</w:t>
@@ -19,14 +18,13 @@
     </w:p>
     <w:p>
       <w:pPr>
-        <w:spacing w:after="120" w:before="0"/>
+        <w:spacing w:after="80"/>
         <w:jc w:val="center"/>
       </w:pPr>
       <w:r>
         <w:rPr>
           <w:rFonts w:ascii="Times New Roman" w:hAnsi="Times New Roman" w:eastAsia="Times New Roman"/>
           <w:b w:val="0"/>
-          <w:i w:val="0"/>
           <w:sz w:val="28"/>
         </w:rPr>
         <w:t>Специальность 5-04-0612-02</w:t>
@@ -34,29 +32,27 @@
     </w:p>
     <w:p>
       <w:pPr>
-        <w:spacing w:after="120" w:before="0"/>
+        <w:spacing w:after="80"/>
         <w:jc w:val="center"/>
       </w:pPr>
       <w:r>
         <w:rPr>
           <w:rFonts w:ascii="Times New Roman" w:hAnsi="Times New Roman" w:eastAsia="Times New Roman"/>
           <w:b w:val="0"/>
-          <w:i w:val="0"/>
-          <w:sz w:val="26"/>
+          <w:sz w:val="24"/>
         </w:rPr>
         <w:t>«Разработка и сопровождение программного обеспечения информационных систем»</w:t>
       </w:r>
     </w:p>
     <w:p>
       <w:pPr>
-        <w:spacing w:after="120" w:before="0"/>
+        <w:spacing w:after="80"/>
         <w:jc w:val="center"/>
       </w:pPr>
       <w:r>
         <w:rPr>
           <w:rFonts w:ascii="Times New Roman" w:hAnsi="Times New Roman" w:eastAsia="Times New Roman"/>
           <w:b w:val="0"/>
-          <w:i w:val="0"/>
           <w:sz w:val="28"/>
         </w:rPr>
         <w:t>Квалификация: Техник-программист</w:t>
@@ -64,28 +60,26 @@
     </w:p>
     <w:p>
       <w:pPr>
-        <w:spacing w:after="120" w:before="0"/>
+        <w:spacing w:after="80"/>
         <w:jc w:val="center"/>
       </w:pPr>
       <w:r>
         <w:rPr>
           <w:rFonts w:ascii="Times New Roman" w:hAnsi="Times New Roman" w:eastAsia="Times New Roman"/>
           <w:b w:val="0"/>
-          <w:i w:val="0"/>
           <w:sz w:val="28"/>
         </w:rPr>
       </w:r>
     </w:p>
     <w:p>
       <w:pPr>
-        <w:spacing w:after="120" w:before="0"/>
+        <w:spacing w:after="80"/>
         <w:jc w:val="center"/>
       </w:pPr>
       <w:r>
         <w:rPr>
           <w:rFonts w:ascii="Times New Roman" w:hAnsi="Times New Roman" w:eastAsia="Times New Roman"/>
           <w:b/>
-          <w:i w:val="0"/>
           <w:sz w:val="32"/>
         </w:rPr>
         <w:t>КОНТРОЛЬНАЯ РАБОТА</w:t>
@@ -93,14 +87,13 @@
     </w:p>
     <w:p>
       <w:pPr>
-        <w:spacing w:after="120" w:before="0"/>
+        <w:spacing w:after="80"/>
         <w:jc w:val="center"/>
       </w:pPr>
       <w:r>
         <w:rPr>
           <w:rFonts w:ascii="Times New Roman" w:hAnsi="Times New Roman" w:eastAsia="Times New Roman"/>
           <w:b w:val="0"/>
-          <w:i w:val="0"/>
           <w:sz w:val="28"/>
         </w:rPr>
         <w:t>при проведении самоконтроля</w:t>
@@ -108,87 +101,40 @@
     </w:p>
     <w:p>
       <w:pPr>
-        <w:spacing w:after="120" w:before="0"/>
+        <w:spacing w:after="80"/>
         <w:jc w:val="center"/>
       </w:pPr>
       <w:r>
         <w:rPr>
           <w:rFonts w:ascii="Times New Roman" w:hAnsi="Times New Roman" w:eastAsia="Times New Roman"/>
           <w:b w:val="0"/>
-          <w:i w:val="0"/>
           <w:sz w:val="28"/>
         </w:rPr>
       </w:r>
     </w:p>
     <w:p>
       <w:pPr>
-        <w:spacing w:after="120" w:before="0"/>
+        <w:spacing w:after="80"/>
         <w:jc w:val="center"/>
       </w:pPr>
       <w:r>
         <w:rPr>
           <w:rFonts w:ascii="Times New Roman" w:hAnsi="Times New Roman" w:eastAsia="Times New Roman"/>
           <w:b w:val="0"/>
-          <w:i w:val="0"/>
           <w:sz w:val="28"/>
         </w:rPr>
-        <w:t>Учебные предметы:</w:t>
+        <w:t>«Тестирование ПО» / «Технология разработки ПО»</w:t>
       </w:r>
     </w:p>
     <w:p>
       <w:pPr>
-        <w:spacing w:after="120" w:before="0"/>
+        <w:spacing w:after="80"/>
         <w:jc w:val="center"/>
       </w:pPr>
       <w:r>
         <w:rPr>
           <w:rFonts w:ascii="Times New Roman" w:hAnsi="Times New Roman" w:eastAsia="Times New Roman"/>
           <w:b w:val="0"/>
-          <w:i w:val="0"/>
-          <w:sz w:val="28"/>
-        </w:rPr>
-        <w:t>«Тестирование программного обеспечения»</w:t>
-      </w:r>
-    </w:p>
-    <w:p>
-      <w:pPr>
-        <w:spacing w:after="120" w:before="0"/>
-        <w:jc w:val="center"/>
-      </w:pPr>
-      <w:r>
-        <w:rPr>
-          <w:rFonts w:ascii="Times New Roman" w:hAnsi="Times New Roman" w:eastAsia="Times New Roman"/>
-          <w:b w:val="0"/>
-          <w:i w:val="0"/>
-          <w:sz w:val="28"/>
-        </w:rPr>
-        <w:t>«Технология разработки программного обеспечения»</w:t>
-      </w:r>
-    </w:p>
-    <w:p>
-      <w:pPr>
-        <w:spacing w:after="120" w:before="0"/>
-        <w:jc w:val="center"/>
-      </w:pPr>
-      <w:r>
-        <w:rPr>
-          <w:rFonts w:ascii="Times New Roman" w:hAnsi="Times New Roman" w:eastAsia="Times New Roman"/>
-          <w:b w:val="0"/>
-          <w:i w:val="0"/>
-          <w:sz w:val="28"/>
-        </w:rPr>
-      </w:r>
-    </w:p>
-    <w:p>
-      <w:pPr>
-        <w:spacing w:after="120" w:before="0"/>
-        <w:jc w:val="center"/>
-      </w:pPr>
-      <w:r>
-        <w:rPr>
-          <w:rFonts w:ascii="Times New Roman" w:hAnsi="Times New Roman" w:eastAsia="Times New Roman"/>
-          <w:b w:val="0"/>
-          <w:i w:val="0"/>
           <w:sz w:val="28"/>
         </w:rPr>
         <w:t>Курс 4, группа №243</w:t>
@@ -196,14 +142,13 @@
     </w:p>
     <w:p>
       <w:pPr>
-        <w:spacing w:after="120" w:before="0"/>
+        <w:spacing w:after="80"/>
         <w:jc w:val="center"/>
       </w:pPr>
       <w:r>
         <w:rPr>
           <w:rFonts w:ascii="Times New Roman" w:hAnsi="Times New Roman" w:eastAsia="Times New Roman"/>
           <w:b/>
-          <w:i w:val="0"/>
           <w:sz w:val="28"/>
         </w:rPr>
         <w:t>Варианты 1–4 (ответы)</w:t>
@@ -211,28 +156,26 @@
     </w:p>
     <w:p>
       <w:pPr>
-        <w:spacing w:after="120" w:before="0"/>
+        <w:spacing w:after="80"/>
         <w:jc w:val="center"/>
       </w:pPr>
       <w:r>
         <w:rPr>
           <w:rFonts w:ascii="Times New Roman" w:hAnsi="Times New Roman" w:eastAsia="Times New Roman"/>
           <w:b w:val="0"/>
-          <w:i w:val="0"/>
           <w:sz w:val="28"/>
         </w:rPr>
       </w:r>
     </w:p>
     <w:p>
       <w:pPr>
-        <w:spacing w:after="120" w:before="0"/>
+        <w:spacing w:after="80"/>
         <w:jc w:val="center"/>
       </w:pPr>
       <w:r>
         <w:rPr>
           <w:rFonts w:ascii="Times New Roman" w:hAnsi="Times New Roman" w:eastAsia="Times New Roman"/>
           <w:b w:val="0"/>
-          <w:i w:val="0"/>
           <w:sz w:val="28"/>
         </w:rPr>
         <w:t>2026</w:t>
@@ -245,7 +188,7 @@
     </w:p>
     <w:p>
       <w:pPr>
-        <w:spacing w:before="240" w:after="160"/>
+        <w:spacing w:before="200" w:after="120"/>
         <w:ind w:firstLine="0"/>
         <w:jc w:val="center"/>
       </w:pPr>
@@ -253,7 +196,6 @@
         <w:rPr>
           <w:rFonts w:ascii="Times New Roman" w:hAnsi="Times New Roman" w:eastAsia="Times New Roman"/>
           <w:b/>
-          <w:i w:val="0"/>
           <w:sz w:val="32"/>
         </w:rPr>
         <w:t>ВАРИАНТ 1</w:t>
@@ -261,22 +203,21 @@
     </w:p>
     <w:p>
       <w:pPr>
-        <w:spacing w:after="120" w:before="0"/>
+        <w:spacing w:after="80"/>
         <w:jc w:val="center"/>
       </w:pPr>
       <w:r>
         <w:rPr>
           <w:rFonts w:ascii="Times New Roman" w:hAnsi="Times New Roman" w:eastAsia="Times New Roman"/>
           <w:b w:val="0"/>
-          <w:i w:val="0"/>
-          <w:sz w:val="26"/>
+          <w:sz w:val="24"/>
         </w:rPr>
         <w:t>Учебный предмет: «Тестирование программного обеспечения»</w:t>
       </w:r>
     </w:p>
     <w:p>
       <w:pPr>
-        <w:spacing w:before="240" w:after="160"/>
+        <w:spacing w:before="200" w:after="120"/>
         <w:ind w:firstLine="0"/>
         <w:jc w:val="left"/>
       </w:pPr>
@@ -284,15 +225,14 @@
         <w:rPr>
           <w:rFonts w:ascii="Times New Roman" w:hAnsi="Times New Roman" w:eastAsia="Times New Roman"/>
           <w:b/>
-          <w:i w:val="0"/>
           <w:sz w:val="28"/>
         </w:rPr>
-        <w:t>1. Определение понятия «Тест-кейс». Жизненный цикл тест-кейса</w:t>
+        <w:t>1. Тест-кейс. Жизненный цикл тест-кейса</w:t>
       </w:r>
     </w:p>
     <w:p>
       <w:pPr>
-        <w:spacing w:after="120"/>
+        <w:spacing w:after="80"/>
         <w:ind w:firstLine="709"/>
         <w:jc w:val="both"/>
       </w:pPr>
@@ -300,15 +240,14 @@
         <w:rPr>
           <w:rFonts w:ascii="Times New Roman" w:hAnsi="Times New Roman" w:eastAsia="Times New Roman"/>
           <w:b w:val="0"/>
-          <w:i w:val="0"/>
           <w:sz w:val="28"/>
         </w:rPr>
-        <w:t>Тест-кейс (test case) — формализованный набор условий, входных данных, шагов выполнения и ожидаемых результатов, предназначенный для проверки конкретной функции, требования или сценария использования программного обеспечения. Тест-кейс позволяет однозначно воспроизвести проверку и зафиксировать её результат.</w:t>
+        <w:t>Тест-кейс — формализованный набор предусловий, шагов, данных и ожидаемого результата для проверки конкретной функции или сценария. Обычно содержит: ID, название, шаги, ожидаемый/фактический результат, статус, приоритет.</w:t>
       </w:r>
     </w:p>
     <w:p>
       <w:pPr>
-        <w:spacing w:after="120"/>
+        <w:spacing w:after="80"/>
         <w:ind w:firstLine="709"/>
         <w:jc w:val="both"/>
       </w:pPr>
@@ -316,15 +255,134 @@
         <w:rPr>
           <w:rFonts w:ascii="Times New Roman" w:hAnsi="Times New Roman" w:eastAsia="Times New Roman"/>
           <w:b w:val="0"/>
-          <w:i w:val="0"/>
           <w:sz w:val="28"/>
         </w:rPr>
-        <w:t>Типичная структура тест-кейса включает: идентификатор, название, предусловия, шаги выполнения, тестовые данные, ожидаемый результат, фактический результат, статус выполнения, приоритет и автора.</w:t>
+        <w:t>Жизненный цикл тест-кейса:</w:t>
       </w:r>
     </w:p>
     <w:p>
       <w:pPr>
-        <w:spacing w:after="120"/>
+        <w:pStyle w:val="ListNumber"/>
+        <w:spacing w:after="40"/>
+        <w:jc w:val="both"/>
+      </w:pPr>
+      <w:r>
+        <w:rPr>
+          <w:rFonts w:ascii="Times New Roman" w:hAnsi="Times New Roman" w:eastAsia="Times New Roman"/>
+          <w:b w:val="0"/>
+          <w:sz w:val="28"/>
+        </w:rPr>
+        <w:t>Создание — на основе требований и сценариев.</w:t>
+      </w:r>
+    </w:p>
+    <w:p>
+      <w:pPr>
+        <w:pStyle w:val="ListNumber"/>
+        <w:spacing w:after="40"/>
+        <w:jc w:val="both"/>
+      </w:pPr>
+      <w:r>
+        <w:rPr>
+          <w:rFonts w:ascii="Times New Roman" w:hAnsi="Times New Roman" w:eastAsia="Times New Roman"/>
+          <w:b w:val="0"/>
+          <w:sz w:val="28"/>
+        </w:rPr>
+        <w:t>Ревью — проверка полноты и однозначности.</w:t>
+      </w:r>
+    </w:p>
+    <w:p>
+      <w:pPr>
+        <w:pStyle w:val="ListNumber"/>
+        <w:spacing w:after="40"/>
+        <w:jc w:val="both"/>
+      </w:pPr>
+      <w:r>
+        <w:rPr>
+          <w:rFonts w:ascii="Times New Roman" w:hAnsi="Times New Roman" w:eastAsia="Times New Roman"/>
+          <w:b w:val="0"/>
+          <w:sz w:val="28"/>
+        </w:rPr>
+        <w:t>Утверждение (Ready) — готов к выполнению.</w:t>
+      </w:r>
+    </w:p>
+    <w:p>
+      <w:pPr>
+        <w:pStyle w:val="ListNumber"/>
+        <w:spacing w:after="40"/>
+        <w:jc w:val="both"/>
+      </w:pPr>
+      <w:r>
+        <w:rPr>
+          <w:rFonts w:ascii="Times New Roman" w:hAnsi="Times New Roman" w:eastAsia="Times New Roman"/>
+          <w:b w:val="0"/>
+          <w:sz w:val="28"/>
+        </w:rPr>
+        <w:t>Выполнение — Pass / Fail / Blocked / Skipped.</w:t>
+      </w:r>
+    </w:p>
+    <w:p>
+      <w:pPr>
+        <w:pStyle w:val="ListNumber"/>
+        <w:spacing w:after="40"/>
+        <w:jc w:val="both"/>
+      </w:pPr>
+      <w:r>
+        <w:rPr>
+          <w:rFonts w:ascii="Times New Roman" w:hAnsi="Times New Roman" w:eastAsia="Times New Roman"/>
+          <w:b w:val="0"/>
+          <w:sz w:val="28"/>
+        </w:rPr>
+        <w:t>Анализ — при Fail создаётся дефект; кейс при необходимости уточняется.</w:t>
+      </w:r>
+    </w:p>
+    <w:p>
+      <w:pPr>
+        <w:pStyle w:val="ListNumber"/>
+        <w:spacing w:after="40"/>
+        <w:jc w:val="both"/>
+      </w:pPr>
+      <w:r>
+        <w:rPr>
+          <w:rFonts w:ascii="Times New Roman" w:hAnsi="Times New Roman" w:eastAsia="Times New Roman"/>
+          <w:b w:val="0"/>
+          <w:sz w:val="28"/>
+        </w:rPr>
+        <w:t>Обновление — правки при изменении ПО или требований.</w:t>
+      </w:r>
+    </w:p>
+    <w:p>
+      <w:pPr>
+        <w:pStyle w:val="ListNumber"/>
+        <w:spacing w:after="40"/>
+        <w:jc w:val="both"/>
+      </w:pPr>
+      <w:r>
+        <w:rPr>
+          <w:rFonts w:ascii="Times New Roman" w:hAnsi="Times New Roman" w:eastAsia="Times New Roman"/>
+          <w:b w:val="0"/>
+          <w:sz w:val="28"/>
+        </w:rPr>
+        <w:t>Архивация — если проверка устарела.</w:t>
+      </w:r>
+    </w:p>
+    <w:p>
+      <w:pPr>
+        <w:spacing w:before="200" w:after="120"/>
+        <w:ind w:firstLine="0"/>
+        <w:jc w:val="left"/>
+      </w:pPr>
+      <w:r>
+        <w:rPr>
+          <w:rFonts w:ascii="Times New Roman" w:hAnsi="Times New Roman" w:eastAsia="Times New Roman"/>
+          <w:b/>
+          <w:sz w:val="28"/>
+        </w:rPr>
+        <w:t>2. Особенности модульного тестирования</w:t>
+      </w:r>
+    </w:p>
+    <w:p>
+      <w:pPr>
+        <w:spacing w:after="80"/>
         <w:ind w:firstLine="709"/>
         <w:jc w:val="both"/>
       </w:pPr>
@@ -332,127 +390,89 @@
         <w:rPr>
           <w:rFonts w:ascii="Times New Roman" w:hAnsi="Times New Roman" w:eastAsia="Times New Roman"/>
           <w:b w:val="0"/>
-          <w:i w:val="0"/>
           <w:sz w:val="28"/>
         </w:rPr>
-        <w:t>Жизненный цикл тест-кейса — это последовательность состояний, которые проходит тест-кейс от создания до архивации:</w:t>
+        <w:t>Модульное (unit) тестирование — проверка наименьших частей кода (функций, методов, классов) в изоляции.</w:t>
       </w:r>
     </w:p>
     <w:p>
       <w:pPr>
-        <w:pStyle w:val="ListNumber"/>
-        <w:spacing w:after="60"/>
+        <w:pStyle w:val="ListBullet"/>
+        <w:spacing w:after="40"/>
         <w:jc w:val="both"/>
       </w:pPr>
       <w:r>
         <w:rPr>
           <w:rFonts w:ascii="Times New Roman" w:hAnsi="Times New Roman" w:eastAsia="Times New Roman"/>
           <w:b w:val="0"/>
-          <w:i w:val="0"/>
           <w:sz w:val="28"/>
         </w:rPr>
-        <w:t>Создание — тест-кейс разрабатывается на основе требований, спецификаций, use case или пользовательских сценариев.</w:t>
+        <w:t>Выполняется разработчиками, тесты быстрые и запускаются часто (CI).</w:t>
       </w:r>
     </w:p>
     <w:p>
       <w:pPr>
-        <w:pStyle w:val="ListNumber"/>
-        <w:spacing w:after="60"/>
+        <w:pStyle w:val="ListBullet"/>
+        <w:spacing w:after="40"/>
         <w:jc w:val="both"/>
       </w:pPr>
       <w:r>
         <w:rPr>
           <w:rFonts w:ascii="Times New Roman" w:hAnsi="Times New Roman" w:eastAsia="Times New Roman"/>
           <w:b w:val="0"/>
-          <w:i w:val="0"/>
           <w:sz w:val="28"/>
         </w:rPr>
-        <w:t>Ревью (проверка) — коллегиальная или формальная проверка полноты, однозначности, корректности шагов и трассируемости к требованиям.</w:t>
+        <w:t>Зависимости изолируют моками и стабами.</w:t>
       </w:r>
     </w:p>
     <w:p>
       <w:pPr>
-        <w:pStyle w:val="ListNumber"/>
-        <w:spacing w:after="60"/>
+        <w:pStyle w:val="ListBullet"/>
+        <w:spacing w:after="40"/>
         <w:jc w:val="both"/>
       </w:pPr>
       <w:r>
         <w:rPr>
           <w:rFonts w:ascii="Times New Roman" w:hAnsi="Times New Roman" w:eastAsia="Times New Roman"/>
           <w:b w:val="0"/>
-          <w:i w:val="0"/>
           <w:sz w:val="28"/>
         </w:rPr>
-        <w:t>Утверждение / готовность — после исправления замечаний тест-кейс получает статус Ready / Approved и может использоваться в прогонах.</w:t>
+        <w:t>Проверяют логику модуля, а не систему целиком.</w:t>
       </w:r>
     </w:p>
     <w:p>
       <w:pPr>
-        <w:pStyle w:val="ListNumber"/>
-        <w:spacing w:after="60"/>
+        <w:pStyle w:val="ListBullet"/>
+        <w:spacing w:after="40"/>
         <w:jc w:val="both"/>
       </w:pPr>
       <w:r>
         <w:rPr>
           <w:rFonts w:ascii="Times New Roman" w:hAnsi="Times New Roman" w:eastAsia="Times New Roman"/>
           <w:b w:val="0"/>
-          <w:i w:val="0"/>
           <w:sz w:val="28"/>
         </w:rPr>
-        <w:t>Выполнение — тестировщик (или автотест) выполняет шаги, фиксирует фактический результат и статус: Pass, Fail, Blocked, Skipped.</w:t>
+        <w:t>Автоматизация обязательна (JUnit, pytest и др.).</w:t>
       </w:r>
     </w:p>
     <w:p>
       <w:pPr>
-        <w:pStyle w:val="ListNumber"/>
-        <w:spacing w:after="60"/>
+        <w:pStyle w:val="ListBullet"/>
+        <w:spacing w:after="40"/>
         <w:jc w:val="both"/>
       </w:pPr>
       <w:r>
         <w:rPr>
           <w:rFonts w:ascii="Times New Roman" w:hAnsi="Times New Roman" w:eastAsia="Times New Roman"/>
           <w:b w:val="0"/>
-          <w:i w:val="0"/>
           <w:sz w:val="28"/>
         </w:rPr>
-        <w:t>Анализ результата — при статусе Fail создаётся отчёт о дефекте; при необходимости тест-кейс уточняется.</w:t>
+        <w:t>Цель — рано найти дефекты и снизить стоимость исправления.</w:t>
       </w:r>
     </w:p>
     <w:p>
       <w:pPr>
-        <w:pStyle w:val="ListNumber"/>
-        <w:spacing w:after="60"/>
-        <w:jc w:val="both"/>
-      </w:pPr>
-      <w:r>
-        <w:rPr>
-          <w:rFonts w:ascii="Times New Roman" w:hAnsi="Times New Roman" w:eastAsia="Times New Roman"/>
-          <w:b w:val="0"/>
-          <w:i w:val="0"/>
-          <w:sz w:val="28"/>
-        </w:rPr>
-        <w:t>Сопровождение (обновление) — при изменении требований или функциональности тест-кейс корректируется.</w:t>
-      </w:r>
-    </w:p>
-    <w:p>
-      <w:pPr>
-        <w:pStyle w:val="ListNumber"/>
-        <w:spacing w:after="60"/>
-        <w:jc w:val="both"/>
-      </w:pPr>
-      <w:r>
-        <w:rPr>
-          <w:rFonts w:ascii="Times New Roman" w:hAnsi="Times New Roman" w:eastAsia="Times New Roman"/>
-          <w:b w:val="0"/>
-          <w:i w:val="0"/>
-          <w:sz w:val="28"/>
-        </w:rPr>
-        <w:t>Архивация / удаление — тест-кейс выводится из активного набора, если функциональность снята или проверка устарела.</w:t>
-      </w:r>
-    </w:p>
-    <w:p>
-      <w:pPr>
-        <w:spacing w:before="240" w:after="160"/>
+        <w:spacing w:before="200" w:after="120"/>
         <w:ind w:firstLine="0"/>
         <w:jc w:val="left"/>
       </w:pPr>
@@ -460,15 +480,14 @@
         <w:rPr>
           <w:rFonts w:ascii="Times New Roman" w:hAnsi="Times New Roman" w:eastAsia="Times New Roman"/>
           <w:b/>
-          <w:i w:val="0"/>
           <w:sz w:val="28"/>
         </w:rPr>
-        <w:t>2. Особенности организации модульного тестирования</w:t>
+        <w:t>3. Системное тестирование: цели, задачи, виды</w:t>
       </w:r>
     </w:p>
     <w:p>
       <w:pPr>
-        <w:spacing w:after="120"/>
+        <w:spacing w:after="80"/>
         <w:ind w:firstLine="709"/>
         <w:jc w:val="both"/>
       </w:pPr>
@@ -476,15 +495,14 @@
         <w:rPr>
           <w:rFonts w:ascii="Times New Roman" w:hAnsi="Times New Roman" w:eastAsia="Times New Roman"/>
           <w:b w:val="0"/>
-          <w:i w:val="0"/>
           <w:sz w:val="28"/>
         </w:rPr>
-        <w:t>Модульное (unit) тестирование — это уровень тестирования, на котором проверяются наименьшие независимые части программного кода: функции, методы, классы, модули — в изоляции от остальной системы.</w:t>
+        <w:t>Цели: проверить систему как целое на соответствие требованиям; оценить взаимодействие компонентов и готовность к релизу.</w:t>
       </w:r>
     </w:p>
     <w:p>
       <w:pPr>
-        <w:spacing w:after="120"/>
+        <w:spacing w:after="80"/>
         <w:ind w:firstLine="709"/>
         <w:jc w:val="both"/>
       </w:pPr>
@@ -492,150 +510,14 @@
         <w:rPr>
           <w:rFonts w:ascii="Times New Roman" w:hAnsi="Times New Roman" w:eastAsia="Times New Roman"/>
           <w:b w:val="0"/>
-          <w:i w:val="0"/>
           <w:sz w:val="28"/>
         </w:rPr>
-        <w:t>Особенности организации модульного тестирования:</w:t>
+        <w:t>Задачи: end-to-end проверка функций; нефункциональные проверки; поиск дефектов на стыках; оценка стабильности.</w:t>
       </w:r>
     </w:p>
     <w:p>
       <w:pPr>
-        <w:pStyle w:val="ListBullet"/>
-        <w:spacing w:after="60"/>
-        <w:ind w:firstLine="0"/>
-        <w:jc w:val="both"/>
-      </w:pPr>
-      <w:r>
-        <w:rPr>
-          <w:rFonts w:ascii="Times New Roman" w:hAnsi="Times New Roman" w:eastAsia="Times New Roman"/>
-          <w:b w:val="0"/>
-          <w:i w:val="0"/>
-          <w:sz w:val="28"/>
-        </w:rPr>
-        <w:t>Выполняется преимущественно разработчиками на этапе написания или сразу после написания кода.</w:t>
-      </w:r>
-    </w:p>
-    <w:p>
-      <w:pPr>
-        <w:pStyle w:val="ListBullet"/>
-        <w:spacing w:after="60"/>
-        <w:ind w:firstLine="0"/>
-        <w:jc w:val="both"/>
-      </w:pPr>
-      <w:r>
-        <w:rPr>
-          <w:rFonts w:ascii="Times New Roman" w:hAnsi="Times New Roman" w:eastAsia="Times New Roman"/>
-          <w:b w:val="0"/>
-          <w:i w:val="0"/>
-          <w:sz w:val="28"/>
-        </w:rPr>
-        <w:t>Тесты должны быть быстрыми и запускаться часто, в том числе в составе непрерывной интеграции (CI).</w:t>
-      </w:r>
-    </w:p>
-    <w:p>
-      <w:pPr>
-        <w:pStyle w:val="ListBullet"/>
-        <w:spacing w:after="60"/>
-        <w:ind w:firstLine="0"/>
-        <w:jc w:val="both"/>
-      </w:pPr>
-      <w:r>
-        <w:rPr>
-          <w:rFonts w:ascii="Times New Roman" w:hAnsi="Times New Roman" w:eastAsia="Times New Roman"/>
-          <w:b w:val="0"/>
-          <w:i w:val="0"/>
-          <w:sz w:val="28"/>
-        </w:rPr>
-        <w:t>Внешние зависимости (база данных, сеть, файловая система, сторонние сервисы) изолируются с помощью заглушек, моков и стабов.</w:t>
-      </w:r>
-    </w:p>
-    <w:p>
-      <w:pPr>
-        <w:pStyle w:val="ListBullet"/>
-        <w:spacing w:after="60"/>
-        <w:ind w:firstLine="0"/>
-        <w:jc w:val="both"/>
-      </w:pPr>
-      <w:r>
-        <w:rPr>
-          <w:rFonts w:ascii="Times New Roman" w:hAnsi="Times New Roman" w:eastAsia="Times New Roman"/>
-          <w:b w:val="0"/>
-          <w:i w:val="0"/>
-          <w:sz w:val="28"/>
-        </w:rPr>
-        <w:t>Проверяется корректность внутренней логики модуля, а не поведение системы в целом.</w:t>
-      </w:r>
-    </w:p>
-    <w:p>
-      <w:pPr>
-        <w:pStyle w:val="ListBullet"/>
-        <w:spacing w:after="60"/>
-        <w:ind w:firstLine="0"/>
-        <w:jc w:val="both"/>
-      </w:pPr>
-      <w:r>
-        <w:rPr>
-          <w:rFonts w:ascii="Times New Roman" w:hAnsi="Times New Roman" w:eastAsia="Times New Roman"/>
-          <w:b w:val="0"/>
-          <w:i w:val="0"/>
-          <w:sz w:val="28"/>
-        </w:rPr>
-        <w:t>Обеспечивается высокая детализация проверок: граничные значения, ветвления, обработка ошибок.</w:t>
-      </w:r>
-    </w:p>
-    <w:p>
-      <w:pPr>
-        <w:pStyle w:val="ListBullet"/>
-        <w:spacing w:after="60"/>
-        <w:ind w:firstLine="0"/>
-        <w:jc w:val="both"/>
-      </w:pPr>
-      <w:r>
-        <w:rPr>
-          <w:rFonts w:ascii="Times New Roman" w:hAnsi="Times New Roman" w:eastAsia="Times New Roman"/>
-          <w:b w:val="0"/>
-          <w:i w:val="0"/>
-          <w:sz w:val="28"/>
-        </w:rPr>
-        <w:t>Автоматизация является обязательной практикой (JUnit, NUnit, pytest, Jest и др.).</w:t>
-      </w:r>
-    </w:p>
-    <w:p>
-      <w:pPr>
-        <w:pStyle w:val="ListBullet"/>
-        <w:spacing w:after="60"/>
-        <w:ind w:firstLine="0"/>
-        <w:jc w:val="both"/>
-      </w:pPr>
-      <w:r>
-        <w:rPr>
-          <w:rFonts w:ascii="Times New Roman" w:hAnsi="Times New Roman" w:eastAsia="Times New Roman"/>
-          <w:b w:val="0"/>
-          <w:i w:val="0"/>
-          <w:sz w:val="28"/>
-        </w:rPr>
-        <w:t>Цель — раннее обнаружение дефектов внутри модуля и снижение стоимости их исправления.</w:t>
-      </w:r>
-    </w:p>
-    <w:p>
-      <w:pPr>
-        <w:spacing w:before="240" w:after="160"/>
-        <w:ind w:firstLine="0"/>
-        <w:jc w:val="left"/>
-      </w:pPr>
-      <w:r>
-        <w:rPr>
-          <w:rFonts w:ascii="Times New Roman" w:hAnsi="Times New Roman" w:eastAsia="Times New Roman"/>
-          <w:b/>
-          <w:i w:val="0"/>
-          <w:sz w:val="28"/>
-        </w:rPr>
-        <w:t>3. Цели и задачи системного тестирования. Виды системного тестирования</w:t>
-      </w:r>
-    </w:p>
-    <w:p>
-      <w:pPr>
-        <w:spacing w:after="120"/>
+        <w:spacing w:after="80"/>
         <w:ind w:firstLine="709"/>
         <w:jc w:val="both"/>
       </w:pPr>
@@ -643,313 +525,9 @@
         <w:rPr>
           <w:rFonts w:ascii="Times New Roman" w:hAnsi="Times New Roman" w:eastAsia="Times New Roman"/>
           <w:b w:val="0"/>
-          <w:i w:val="0"/>
           <w:sz w:val="28"/>
         </w:rPr>
-        <w:t>Системное тестирование — уровень тестирования, на котором программный продукт проверяется как единое целое после интеграции всех компонентов.</w:t>
-      </w:r>
-    </w:p>
-    <w:p>
-      <w:pPr>
-        <w:spacing w:after="120"/>
-        <w:ind w:firstLine="709"/>
-        <w:jc w:val="both"/>
-      </w:pPr>
-      <w:r>
-        <w:rPr>
-          <w:rFonts w:ascii="Times New Roman" w:hAnsi="Times New Roman" w:eastAsia="Times New Roman"/>
-          <w:b w:val="0"/>
-          <w:i w:val="0"/>
-          <w:sz w:val="28"/>
-        </w:rPr>
-        <w:t>Цели системного тестирования:</w:t>
-      </w:r>
-    </w:p>
-    <w:p>
-      <w:pPr>
-        <w:pStyle w:val="ListBullet"/>
-        <w:spacing w:after="60"/>
-        <w:ind w:firstLine="0"/>
-        <w:jc w:val="both"/>
-      </w:pPr>
-      <w:r>
-        <w:rPr>
-          <w:rFonts w:ascii="Times New Roman" w:hAnsi="Times New Roman" w:eastAsia="Times New Roman"/>
-          <w:b w:val="0"/>
-          <w:i w:val="0"/>
-          <w:sz w:val="28"/>
-        </w:rPr>
-        <w:t>убедиться, что система в целом соответствует установленным требованиям;</w:t>
-      </w:r>
-    </w:p>
-    <w:p>
-      <w:pPr>
-        <w:pStyle w:val="ListBullet"/>
-        <w:spacing w:after="60"/>
-        <w:ind w:firstLine="0"/>
-        <w:jc w:val="both"/>
-      </w:pPr>
-      <w:r>
-        <w:rPr>
-          <w:rFonts w:ascii="Times New Roman" w:hAnsi="Times New Roman" w:eastAsia="Times New Roman"/>
-          <w:b w:val="0"/>
-          <w:i w:val="0"/>
-          <w:sz w:val="28"/>
-        </w:rPr>
-        <w:t>проверить корректное взаимодействие всех подсистем и внешних интерфейсов;</w:t>
-      </w:r>
-    </w:p>
-    <w:p>
-      <w:pPr>
-        <w:pStyle w:val="ListBullet"/>
-        <w:spacing w:after="60"/>
-        <w:ind w:firstLine="0"/>
-        <w:jc w:val="both"/>
-      </w:pPr>
-      <w:r>
-        <w:rPr>
-          <w:rFonts w:ascii="Times New Roman" w:hAnsi="Times New Roman" w:eastAsia="Times New Roman"/>
-          <w:b w:val="0"/>
-          <w:i w:val="0"/>
-          <w:sz w:val="28"/>
-        </w:rPr>
-        <w:t>оценить готовность продукта к приёмочному тестированию и релизу.</w:t>
-      </w:r>
-    </w:p>
-    <w:p>
-      <w:pPr>
-        <w:spacing w:after="120"/>
-        <w:ind w:firstLine="709"/>
-        <w:jc w:val="both"/>
-      </w:pPr>
-      <w:r>
-        <w:rPr>
-          <w:rFonts w:ascii="Times New Roman" w:hAnsi="Times New Roman" w:eastAsia="Times New Roman"/>
-          <w:b w:val="0"/>
-          <w:i w:val="0"/>
-          <w:sz w:val="28"/>
-        </w:rPr>
-        <w:t>Задачи системного тестирования:</w:t>
-      </w:r>
-    </w:p>
-    <w:p>
-      <w:pPr>
-        <w:pStyle w:val="ListBullet"/>
-        <w:spacing w:after="60"/>
-        <w:ind w:firstLine="0"/>
-        <w:jc w:val="both"/>
-      </w:pPr>
-      <w:r>
-        <w:rPr>
-          <w:rFonts w:ascii="Times New Roman" w:hAnsi="Times New Roman" w:eastAsia="Times New Roman"/>
-          <w:b w:val="0"/>
-          <w:i w:val="0"/>
-          <w:sz w:val="28"/>
-        </w:rPr>
-        <w:t>проверка функциональности по сквозным (end-to-end) сценариям;</w:t>
-      </w:r>
-    </w:p>
-    <w:p>
-      <w:pPr>
-        <w:pStyle w:val="ListBullet"/>
-        <w:spacing w:after="60"/>
-        <w:ind w:firstLine="0"/>
-        <w:jc w:val="both"/>
-      </w:pPr>
-      <w:r>
-        <w:rPr>
-          <w:rFonts w:ascii="Times New Roman" w:hAnsi="Times New Roman" w:eastAsia="Times New Roman"/>
-          <w:b w:val="0"/>
-          <w:i w:val="0"/>
-          <w:sz w:val="28"/>
-        </w:rPr>
-        <w:t>проверка нефункциональных характеристик: производительность, безопасность, удобство использования, совместимость;</w:t>
-      </w:r>
-    </w:p>
-    <w:p>
-      <w:pPr>
-        <w:pStyle w:val="ListBullet"/>
-        <w:spacing w:after="60"/>
-        <w:ind w:firstLine="0"/>
-        <w:jc w:val="both"/>
-      </w:pPr>
-      <w:r>
-        <w:rPr>
-          <w:rFonts w:ascii="Times New Roman" w:hAnsi="Times New Roman" w:eastAsia="Times New Roman"/>
-          <w:b w:val="0"/>
-          <w:i w:val="0"/>
-          <w:sz w:val="28"/>
-        </w:rPr>
-        <w:t>выявление дефектов на стыках модулей и подсистем;</w:t>
-      </w:r>
-    </w:p>
-    <w:p>
-      <w:pPr>
-        <w:pStyle w:val="ListBullet"/>
-        <w:spacing w:after="60"/>
-        <w:ind w:firstLine="0"/>
-        <w:jc w:val="both"/>
-      </w:pPr>
-      <w:r>
-        <w:rPr>
-          <w:rFonts w:ascii="Times New Roman" w:hAnsi="Times New Roman" w:eastAsia="Times New Roman"/>
-          <w:b w:val="0"/>
-          <w:i w:val="0"/>
-          <w:sz w:val="28"/>
-        </w:rPr>
-        <w:t>проверка соответствия спецификации и ожиданиям пользователей;</w:t>
-      </w:r>
-    </w:p>
-    <w:p>
-      <w:pPr>
-        <w:pStyle w:val="ListBullet"/>
-        <w:spacing w:after="60"/>
-        <w:ind w:firstLine="0"/>
-        <w:jc w:val="both"/>
-      </w:pPr>
-      <w:r>
-        <w:rPr>
-          <w:rFonts w:ascii="Times New Roman" w:hAnsi="Times New Roman" w:eastAsia="Times New Roman"/>
-          <w:b w:val="0"/>
-          <w:i w:val="0"/>
-          <w:sz w:val="28"/>
-        </w:rPr>
-        <w:t>оценка стабильности системы перед передачей заказчику.</w:t>
-      </w:r>
-    </w:p>
-    <w:p>
-      <w:pPr>
-        <w:spacing w:after="120"/>
-        <w:ind w:firstLine="709"/>
-        <w:jc w:val="both"/>
-      </w:pPr>
-      <w:r>
-        <w:rPr>
-          <w:rFonts w:ascii="Times New Roman" w:hAnsi="Times New Roman" w:eastAsia="Times New Roman"/>
-          <w:b w:val="0"/>
-          <w:i w:val="0"/>
-          <w:sz w:val="28"/>
-        </w:rPr>
-        <w:t>Основные виды системного тестирования:</w:t>
-      </w:r>
-    </w:p>
-    <w:p>
-      <w:pPr>
-        <w:pStyle w:val="ListBullet"/>
-        <w:spacing w:after="60"/>
-        <w:ind w:firstLine="0"/>
-        <w:jc w:val="both"/>
-      </w:pPr>
-      <w:r>
-        <w:rPr>
-          <w:rFonts w:ascii="Times New Roman" w:hAnsi="Times New Roman" w:eastAsia="Times New Roman"/>
-          <w:b w:val="0"/>
-          <w:i w:val="0"/>
-          <w:sz w:val="28"/>
-        </w:rPr>
-        <w:t>Функциональное тестирование — проверка соответствия бизнес- и функциональным требованиям.</w:t>
-      </w:r>
-    </w:p>
-    <w:p>
-      <w:pPr>
-        <w:pStyle w:val="ListBullet"/>
-        <w:spacing w:after="60"/>
-        <w:ind w:firstLine="0"/>
-        <w:jc w:val="both"/>
-      </w:pPr>
-      <w:r>
-        <w:rPr>
-          <w:rFonts w:ascii="Times New Roman" w:hAnsi="Times New Roman" w:eastAsia="Times New Roman"/>
-          <w:b w:val="0"/>
-          <w:i w:val="0"/>
-          <w:sz w:val="28"/>
-        </w:rPr>
-        <w:t>Нефункциональное тестирование — нагрузка, стресс, безопасность, usability, совместимость и др.</w:t>
-      </w:r>
-    </w:p>
-    <w:p>
-      <w:pPr>
-        <w:pStyle w:val="ListBullet"/>
-        <w:spacing w:after="60"/>
-        <w:ind w:firstLine="0"/>
-        <w:jc w:val="both"/>
-      </w:pPr>
-      <w:r>
-        <w:rPr>
-          <w:rFonts w:ascii="Times New Roman" w:hAnsi="Times New Roman" w:eastAsia="Times New Roman"/>
-          <w:b w:val="0"/>
-          <w:i w:val="0"/>
-          <w:sz w:val="28"/>
-        </w:rPr>
-        <w:t>Регрессионное тестирование — проверка, что после изменений ранее работавшая функциональность не нарушена.</w:t>
-      </w:r>
-    </w:p>
-    <w:p>
-      <w:pPr>
-        <w:pStyle w:val="ListBullet"/>
-        <w:spacing w:after="60"/>
-        <w:ind w:firstLine="0"/>
-        <w:jc w:val="both"/>
-      </w:pPr>
-      <w:r>
-        <w:rPr>
-          <w:rFonts w:ascii="Times New Roman" w:hAnsi="Times New Roman" w:eastAsia="Times New Roman"/>
-          <w:b w:val="0"/>
-          <w:i w:val="0"/>
-          <w:sz w:val="28"/>
-        </w:rPr>
-        <w:t>Дымовое (smoke) тестирование — быстрая проверка базовой работоспособности сборки.</w:t>
-      </w:r>
-    </w:p>
-    <w:p>
-      <w:pPr>
-        <w:pStyle w:val="ListBullet"/>
-        <w:spacing w:after="60"/>
-        <w:ind w:firstLine="0"/>
-        <w:jc w:val="both"/>
-      </w:pPr>
-      <w:r>
-        <w:rPr>
-          <w:rFonts w:ascii="Times New Roman" w:hAnsi="Times New Roman" w:eastAsia="Times New Roman"/>
-          <w:b w:val="0"/>
-          <w:i w:val="0"/>
-          <w:sz w:val="28"/>
-        </w:rPr>
-        <w:t>Санитарное (sanity) тестирование — узкая проверка после небольших исправлений.</w:t>
-      </w:r>
-    </w:p>
-    <w:p>
-      <w:pPr>
-        <w:pStyle w:val="ListBullet"/>
-        <w:spacing w:after="60"/>
-        <w:ind w:firstLine="0"/>
-        <w:jc w:val="both"/>
-      </w:pPr>
-      <w:r>
-        <w:rPr>
-          <w:rFonts w:ascii="Times New Roman" w:hAnsi="Times New Roman" w:eastAsia="Times New Roman"/>
-          <w:b w:val="0"/>
-          <w:i w:val="0"/>
-          <w:sz w:val="28"/>
-        </w:rPr>
-        <w:t>Приёмочное тестирование (UAT) — проверка с точки зрения заказчика и конечного пользователя.</w:t>
-      </w:r>
-    </w:p>
-    <w:p>
-      <w:pPr>
-        <w:pStyle w:val="ListBullet"/>
-        <w:spacing w:after="60"/>
-        <w:ind w:firstLine="0"/>
-        <w:jc w:val="both"/>
-      </w:pPr>
-      <w:r>
-        <w:rPr>
-          <w:rFonts w:ascii="Times New Roman" w:hAnsi="Times New Roman" w:eastAsia="Times New Roman"/>
-          <w:b w:val="0"/>
-          <w:i w:val="0"/>
-          <w:sz w:val="28"/>
-        </w:rPr>
-        <w:t>Сквозное (E2E) тестирование — проверка полных пользовательских сценариев «от начала до конца».</w:t>
+        <w:t>Виды: функциональное; нефункциональное; регрессионное; smoke; sanity; приёмочное (UAT); сквозное (E2E).</w:t>
       </w:r>
     </w:p>
     <w:p>
@@ -959,7 +537,7 @@
     </w:p>
     <w:p>
       <w:pPr>
-        <w:spacing w:before="240" w:after="160"/>
+        <w:spacing w:before="200" w:after="120"/>
         <w:ind w:firstLine="0"/>
         <w:jc w:val="center"/>
       </w:pPr>
@@ -967,7 +545,6 @@
         <w:rPr>
           <w:rFonts w:ascii="Times New Roman" w:hAnsi="Times New Roman" w:eastAsia="Times New Roman"/>
           <w:b/>
-          <w:i w:val="0"/>
           <w:sz w:val="32"/>
         </w:rPr>
         <w:t>ВАРИАНТ 2</w:t>
@@ -975,22 +552,21 @@
     </w:p>
     <w:p>
       <w:pPr>
-        <w:spacing w:after="120" w:before="0"/>
+        <w:spacing w:after="80"/>
         <w:jc w:val="center"/>
       </w:pPr>
       <w:r>
         <w:rPr>
           <w:rFonts w:ascii="Times New Roman" w:hAnsi="Times New Roman" w:eastAsia="Times New Roman"/>
           <w:b w:val="0"/>
-          <w:i w:val="0"/>
-          <w:sz w:val="26"/>
+          <w:sz w:val="24"/>
         </w:rPr>
         <w:t>Учебный предмет: «Технология разработки программного обеспечения»</w:t>
       </w:r>
     </w:p>
     <w:p>
       <w:pPr>
-        <w:spacing w:before="240" w:after="160"/>
+        <w:spacing w:before="200" w:after="120"/>
         <w:ind w:firstLine="0"/>
         <w:jc w:val="left"/>
       </w:pPr>
@@ -998,15 +574,14 @@
         <w:rPr>
           <w:rFonts w:ascii="Times New Roman" w:hAnsi="Times New Roman" w:eastAsia="Times New Roman"/>
           <w:b/>
-          <w:i w:val="0"/>
           <w:sz w:val="28"/>
         </w:rPr>
-        <w:t>1. Понятие «Дефект». Понятие «Отчёт о дефекте». Жизненный цикл дефекта</w:t>
+        <w:t>1. Дефект. Отчёт о дефекте. Жизненный цикл</w:t>
       </w:r>
     </w:p>
     <w:p>
       <w:pPr>
-        <w:spacing w:after="120"/>
+        <w:spacing w:after="80"/>
         <w:ind w:firstLine="709"/>
         <w:jc w:val="both"/>
       </w:pPr>
@@ -1014,15 +589,14 @@
         <w:rPr>
           <w:rFonts w:ascii="Times New Roman" w:hAnsi="Times New Roman" w:eastAsia="Times New Roman"/>
           <w:b w:val="0"/>
-          <w:i w:val="0"/>
           <w:sz w:val="28"/>
         </w:rPr>
-        <w:t>Дефект (bug, defect) — отклонение фактического поведения программного обеспечения от ожидаемого. Ожидаемое поведение определяется требованиями, спецификацией, стандартами или разумными ожиданиями пользователя. Дефект может проявляться как ошибка функциональности, некорректный результат, сбой, несоответствие интерфейса документации и т.п.</w:t>
+        <w:t>Дефект — отклонение фактического поведения ПО от ожидаемого (требования, спецификация, ожидания пользователя).</w:t>
       </w:r>
     </w:p>
     <w:p>
       <w:pPr>
-        <w:spacing w:after="120"/>
+        <w:spacing w:after="80"/>
         <w:ind w:firstLine="709"/>
         <w:jc w:val="both"/>
       </w:pPr>
@@ -1030,15 +604,14 @@
         <w:rPr>
           <w:rFonts w:ascii="Times New Roman" w:hAnsi="Times New Roman" w:eastAsia="Times New Roman"/>
           <w:b w:val="0"/>
-          <w:i w:val="0"/>
           <w:sz w:val="28"/>
         </w:rPr>
-        <w:t>Отчёт о дефекте (bug report) — документ или запись в системе учёта дефектов (Jira, Redmine, YouTrack и др.), содержащая информацию, необходимую для воспроизведения, анализа и исправления проблемы.</w:t>
+        <w:t>Отчёт о дефекте — запись в системе учёта (Jira и др.): заголовок, шаги, ожидаемый/фактический результат, окружение, severity/priority, вложения, статус.</w:t>
       </w:r>
     </w:p>
     <w:p>
       <w:pPr>
-        <w:spacing w:after="120"/>
+        <w:spacing w:after="80"/>
         <w:ind w:firstLine="709"/>
         <w:jc w:val="both"/>
       </w:pPr>
@@ -1046,15 +619,29 @@
         <w:rPr>
           <w:rFonts w:ascii="Times New Roman" w:hAnsi="Times New Roman" w:eastAsia="Times New Roman"/>
           <w:b w:val="0"/>
-          <w:i w:val="0"/>
           <w:sz w:val="28"/>
         </w:rPr>
-        <w:t>Типичное содержание отчёта о дефекте: заголовок; шаги воспроизведения; ожидаемый и фактический результат; окружение (ОС, браузер, версия сборки); серьёзность (severity) и приоритет; вложения (скриншоты, логи, видео); статус; автор и ответственный.</w:t>
+        <w:t>Жизненный цикл: New → Assigned → In Progress → Fixed → Retest → Closed (или Reopened). Возможны Rejected, Deferred, Won’t Fix.</w:t>
       </w:r>
     </w:p>
     <w:p>
       <w:pPr>
-        <w:spacing w:after="120"/>
+        <w:spacing w:before="200" w:after="120"/>
+        <w:ind w:firstLine="0"/>
+        <w:jc w:val="left"/>
+      </w:pPr>
+      <w:r>
+        <w:rPr>
+          <w:rFonts w:ascii="Times New Roman" w:hAnsi="Times New Roman" w:eastAsia="Times New Roman"/>
+          <w:b/>
+          <w:sz w:val="28"/>
+        </w:rPr>
+        <w:t>2. Верификация в ЖЦ ПО. Тестирование документации</w:t>
+      </w:r>
+    </w:p>
+    <w:p>
+      <w:pPr>
+        <w:spacing w:after="80"/>
         <w:ind w:firstLine="709"/>
         <w:jc w:val="both"/>
       </w:pPr>
@@ -1062,127 +649,89 @@
         <w:rPr>
           <w:rFonts w:ascii="Times New Roman" w:hAnsi="Times New Roman" w:eastAsia="Times New Roman"/>
           <w:b w:val="0"/>
-          <w:i w:val="0"/>
           <w:sz w:val="28"/>
         </w:rPr>
-        <w:t>Жизненный цикл дефекта — последовательность статусов от обнаружения до закрытия:</w:t>
+        <w:t>Верификация — проверка «делаем ли продукт правильно?»: соответствие спецификациям и стандартам на текущем этапе.</w:t>
       </w:r>
     </w:p>
     <w:p>
       <w:pPr>
-        <w:pStyle w:val="ListNumber"/>
-        <w:spacing w:after="60"/>
+        <w:pStyle w:val="ListBullet"/>
+        <w:spacing w:after="40"/>
         <w:jc w:val="both"/>
       </w:pPr>
       <w:r>
         <w:rPr>
           <w:rFonts w:ascii="Times New Roman" w:hAnsi="Times New Roman" w:eastAsia="Times New Roman"/>
           <w:b w:val="0"/>
-          <w:i w:val="0"/>
           <w:sz w:val="28"/>
         </w:rPr>
-        <w:t>New / Open — дефект обнаружен и зарегистрирован.</w:t>
+        <w:t>Требования — полнота, непротиворечивость, тестируемость.</w:t>
       </w:r>
     </w:p>
     <w:p>
       <w:pPr>
-        <w:pStyle w:val="ListNumber"/>
-        <w:spacing w:after="60"/>
+        <w:pStyle w:val="ListBullet"/>
+        <w:spacing w:after="40"/>
         <w:jc w:val="both"/>
       </w:pPr>
       <w:r>
         <w:rPr>
           <w:rFonts w:ascii="Times New Roman" w:hAnsi="Times New Roman" w:eastAsia="Times New Roman"/>
           <w:b w:val="0"/>
-          <w:i w:val="0"/>
           <w:sz w:val="28"/>
         </w:rPr>
-        <w:t>Assigned — дефект назначен разработчику для анализа и исправления.</w:t>
+        <w:t>Проектирование — соответствие архитектуры требованиям.</w:t>
       </w:r>
     </w:p>
     <w:p>
       <w:pPr>
-        <w:pStyle w:val="ListNumber"/>
-        <w:spacing w:after="60"/>
+        <w:pStyle w:val="ListBullet"/>
+        <w:spacing w:after="40"/>
         <w:jc w:val="both"/>
       </w:pPr>
       <w:r>
         <w:rPr>
           <w:rFonts w:ascii="Times New Roman" w:hAnsi="Times New Roman" w:eastAsia="Times New Roman"/>
           <w:b w:val="0"/>
-          <w:i w:val="0"/>
           <w:sz w:val="28"/>
         </w:rPr>
-        <w:t>In Progress — ведётся работа по устранению.</w:t>
+        <w:t>Кодирование — review, статический анализ, unit-тесты.</w:t>
       </w:r>
     </w:p>
     <w:p>
       <w:pPr>
-        <w:pStyle w:val="ListNumber"/>
-        <w:spacing w:after="60"/>
+        <w:pStyle w:val="ListBullet"/>
+        <w:spacing w:after="40"/>
         <w:jc w:val="both"/>
       </w:pPr>
       <w:r>
         <w:rPr>
           <w:rFonts w:ascii="Times New Roman" w:hAnsi="Times New Roman" w:eastAsia="Times New Roman"/>
           <w:b w:val="0"/>
-          <w:i w:val="0"/>
           <w:sz w:val="28"/>
         </w:rPr>
-        <w:t>Fixed / Resolved — исправление внесено, дефект передан на проверку.</w:t>
+        <w:t>Интеграция/система — соответствие проекту.</w:t>
       </w:r>
     </w:p>
     <w:p>
       <w:pPr>
-        <w:pStyle w:val="ListNumber"/>
-        <w:spacing w:after="60"/>
+        <w:pStyle w:val="ListBullet"/>
+        <w:spacing w:after="40"/>
         <w:jc w:val="both"/>
       </w:pPr>
       <w:r>
         <w:rPr>
           <w:rFonts w:ascii="Times New Roman" w:hAnsi="Times New Roman" w:eastAsia="Times New Roman"/>
           <w:b w:val="0"/>
-          <w:i w:val="0"/>
           <w:sz w:val="28"/>
         </w:rPr>
-        <w:t>Retest — тестировщик повторно проверяет исправление.</w:t>
+        <w:t>Поставка — комплектность и критерии приёмки.</w:t>
       </w:r>
     </w:p>
     <w:p>
       <w:pPr>
-        <w:pStyle w:val="ListNumber"/>
-        <w:spacing w:after="60"/>
-        <w:jc w:val="both"/>
-      </w:pPr>
-      <w:r>
-        <w:rPr>
-          <w:rFonts w:ascii="Times New Roman" w:hAnsi="Times New Roman" w:eastAsia="Times New Roman"/>
-          <w:b w:val="0"/>
-          <w:i w:val="0"/>
-          <w:sz w:val="28"/>
-        </w:rPr>
-        <w:t>Closed — исправление подтверждено, дефект закрыт.</w:t>
-      </w:r>
-    </w:p>
-    <w:p>
-      <w:pPr>
-        <w:pStyle w:val="ListNumber"/>
-        <w:spacing w:after="60"/>
-        <w:jc w:val="both"/>
-      </w:pPr>
-      <w:r>
-        <w:rPr>
-          <w:rFonts w:ascii="Times New Roman" w:hAnsi="Times New Roman" w:eastAsia="Times New Roman"/>
-          <w:b w:val="0"/>
-          <w:i w:val="0"/>
-          <w:sz w:val="28"/>
-        </w:rPr>
-        <w:t>Reopened — при повторном обнаружении проблемы дефект открывается заново.</w:t>
-      </w:r>
-    </w:p>
-    <w:p>
-      <w:pPr>
-        <w:spacing w:after="120"/>
+        <w:spacing w:after="80"/>
         <w:ind w:firstLine="709"/>
         <w:jc w:val="both"/>
       </w:pPr>
@@ -1190,15 +739,29 @@
         <w:rPr>
           <w:rFonts w:ascii="Times New Roman" w:hAnsi="Times New Roman" w:eastAsia="Times New Roman"/>
           <w:b w:val="0"/>
-          <w:i w:val="0"/>
           <w:sz w:val="28"/>
         </w:rPr>
-        <w:t>Возможны дополнительные статусы: Rejected (не является дефектом, дубликат), Deferred (отложено), Won’t Fix (исправление не планируется).</w:t>
+        <w:t>Тестирование документации — проверка ТЗ, спецификаций, руководств на полноту и актуальность.</w:t>
       </w:r>
     </w:p>
     <w:p>
       <w:pPr>
-        <w:spacing w:before="240" w:after="160"/>
+        <w:spacing w:after="80"/>
+        <w:ind w:firstLine="709"/>
+        <w:jc w:val="both"/>
+      </w:pPr>
+      <w:r>
+        <w:rPr>
+          <w:rFonts w:ascii="Times New Roman" w:hAnsi="Times New Roman" w:eastAsia="Times New Roman"/>
+          <w:b w:val="0"/>
+          <w:sz w:val="28"/>
+        </w:rPr>
+        <w:t>Методы: ревью/инспекция; чек-листы; трассировка «требование → тест»; сравнение с фактическим поведением ПО.</w:t>
+      </w:r>
+    </w:p>
+    <w:p>
+      <w:pPr>
+        <w:spacing w:before="200" w:after="120"/>
         <w:ind w:firstLine="0"/>
         <w:jc w:val="left"/>
       </w:pPr>
@@ -1206,15 +769,14 @@
         <w:rPr>
           <w:rFonts w:ascii="Times New Roman" w:hAnsi="Times New Roman" w:eastAsia="Times New Roman"/>
           <w:b/>
-          <w:i w:val="0"/>
           <w:sz w:val="28"/>
         </w:rPr>
-        <w:t>2. Задачи верификации в рамках жизненного цикла ПО. Тестирование документации, методы</w:t>
+        <w:t>3. Нефункциональное тестирование: виды</w:t>
       </w:r>
     </w:p>
     <w:p>
       <w:pPr>
-        <w:spacing w:after="120"/>
+        <w:spacing w:after="80"/>
         <w:ind w:firstLine="709"/>
         <w:jc w:val="both"/>
       </w:pPr>
@@ -1222,260 +784,9 @@
         <w:rPr>
           <w:rFonts w:ascii="Times New Roman" w:hAnsi="Times New Roman" w:eastAsia="Times New Roman"/>
           <w:b w:val="0"/>
-          <w:i w:val="0"/>
           <w:sz w:val="28"/>
         </w:rPr>
-        <w:t>Верификация — процесс проверки того, что продукт на текущем этапе разработки соответствует заданным спецификациям, стандартам и правилам («делаем ли мы продукт правильно?»). Верификация отличается от валидации, которая отвечает на вопрос: «делаем ли мы правильный продукт?»</w:t>
-      </w:r>
-    </w:p>
-    <w:p>
-      <w:pPr>
-        <w:spacing w:after="120"/>
-        <w:ind w:firstLine="709"/>
-        <w:jc w:val="both"/>
-      </w:pPr>
-      <w:r>
-        <w:rPr>
-          <w:rFonts w:ascii="Times New Roman" w:hAnsi="Times New Roman" w:eastAsia="Times New Roman"/>
-          <w:b w:val="0"/>
-          <w:i w:val="0"/>
-          <w:sz w:val="28"/>
-        </w:rPr>
-        <w:t>Задачи верификации на этапах жизненного цикла ПО:</w:t>
-      </w:r>
-    </w:p>
-    <w:p>
-      <w:pPr>
-        <w:pStyle w:val="ListBullet"/>
-        <w:spacing w:after="60"/>
-        <w:ind w:firstLine="0"/>
-        <w:jc w:val="both"/>
-      </w:pPr>
-      <w:r>
-        <w:rPr>
-          <w:rFonts w:ascii="Times New Roman" w:hAnsi="Times New Roman" w:eastAsia="Times New Roman"/>
-          <w:b w:val="0"/>
-          <w:i w:val="0"/>
-          <w:sz w:val="28"/>
-        </w:rPr>
-        <w:t>Анализ требований — проверка полноты, непротиворечивости, однозначности и тестируемости требований.</w:t>
-      </w:r>
-    </w:p>
-    <w:p>
-      <w:pPr>
-        <w:pStyle w:val="ListBullet"/>
-        <w:spacing w:after="60"/>
-        <w:ind w:firstLine="0"/>
-        <w:jc w:val="both"/>
-      </w:pPr>
-      <w:r>
-        <w:rPr>
-          <w:rFonts w:ascii="Times New Roman" w:hAnsi="Times New Roman" w:eastAsia="Times New Roman"/>
-          <w:b w:val="0"/>
-          <w:i w:val="0"/>
-          <w:sz w:val="28"/>
-        </w:rPr>
-        <w:t>Проектирование — проверка соответствия архитектуры и проектных решений требованиям.</w:t>
-      </w:r>
-    </w:p>
-    <w:p>
-      <w:pPr>
-        <w:pStyle w:val="ListBullet"/>
-        <w:spacing w:after="60"/>
-        <w:ind w:firstLine="0"/>
-        <w:jc w:val="both"/>
-      </w:pPr>
-      <w:r>
-        <w:rPr>
-          <w:rFonts w:ascii="Times New Roman" w:hAnsi="Times New Roman" w:eastAsia="Times New Roman"/>
-          <w:b w:val="0"/>
-          <w:i w:val="0"/>
-          <w:sz w:val="28"/>
-        </w:rPr>
-        <w:t>Кодирование — code review, статический анализ, модульное тестирование.</w:t>
-      </w:r>
-    </w:p>
-    <w:p>
-      <w:pPr>
-        <w:pStyle w:val="ListBullet"/>
-        <w:spacing w:after="60"/>
-        <w:ind w:firstLine="0"/>
-        <w:jc w:val="both"/>
-      </w:pPr>
-      <w:r>
-        <w:rPr>
-          <w:rFonts w:ascii="Times New Roman" w:hAnsi="Times New Roman" w:eastAsia="Times New Roman"/>
-          <w:b w:val="0"/>
-          <w:i w:val="0"/>
-          <w:sz w:val="28"/>
-        </w:rPr>
-        <w:t>Интеграция и системное тестирование — проверка соответствия собранной системы проекту и требованиям.</w:t>
-      </w:r>
-    </w:p>
-    <w:p>
-      <w:pPr>
-        <w:pStyle w:val="ListBullet"/>
-        <w:spacing w:after="60"/>
-        <w:ind w:firstLine="0"/>
-        <w:jc w:val="both"/>
-      </w:pPr>
-      <w:r>
-        <w:rPr>
-          <w:rFonts w:ascii="Times New Roman" w:hAnsi="Times New Roman" w:eastAsia="Times New Roman"/>
-          <w:b w:val="0"/>
-          <w:i w:val="0"/>
-          <w:sz w:val="28"/>
-        </w:rPr>
-        <w:t>Поставка — проверка комплектности поставки и соответствия критериям приёмки.</w:t>
-      </w:r>
-    </w:p>
-    <w:p>
-      <w:pPr>
-        <w:spacing w:after="120"/>
-        <w:ind w:firstLine="709"/>
-        <w:jc w:val="both"/>
-      </w:pPr>
-      <w:r>
-        <w:rPr>
-          <w:rFonts w:ascii="Times New Roman" w:hAnsi="Times New Roman" w:eastAsia="Times New Roman"/>
-          <w:b w:val="0"/>
-          <w:i w:val="0"/>
-          <w:sz w:val="28"/>
-        </w:rPr>
-        <w:t>Тестирование документации — проверка артефактов проекта (техническое задание, спецификации, руководства пользователя, help, API-документация) на полноту, актуальность, однозначность, согласованность и трассируемость к требованиям и реализации.</w:t>
-      </w:r>
-    </w:p>
-    <w:p>
-      <w:pPr>
-        <w:spacing w:after="120"/>
-        <w:ind w:firstLine="709"/>
-        <w:jc w:val="both"/>
-      </w:pPr>
-      <w:r>
-        <w:rPr>
-          <w:rFonts w:ascii="Times New Roman" w:hAnsi="Times New Roman" w:eastAsia="Times New Roman"/>
-          <w:b w:val="0"/>
-          <w:i w:val="0"/>
-          <w:sz w:val="28"/>
-        </w:rPr>
-        <w:t>Методы тестирования документации:</w:t>
-      </w:r>
-    </w:p>
-    <w:p>
-      <w:pPr>
-        <w:pStyle w:val="ListBullet"/>
-        <w:spacing w:after="60"/>
-        <w:ind w:firstLine="0"/>
-        <w:jc w:val="both"/>
-      </w:pPr>
-      <w:r>
-        <w:rPr>
-          <w:rFonts w:ascii="Times New Roman" w:hAnsi="Times New Roman" w:eastAsia="Times New Roman"/>
-          <w:b w:val="0"/>
-          <w:i w:val="0"/>
-          <w:sz w:val="28"/>
-        </w:rPr>
-        <w:t>ревью, инспекция, walkthrough;</w:t>
-      </w:r>
-    </w:p>
-    <w:p>
-      <w:pPr>
-        <w:pStyle w:val="ListBullet"/>
-        <w:spacing w:after="60"/>
-        <w:ind w:firstLine="0"/>
-        <w:jc w:val="both"/>
-      </w:pPr>
-      <w:r>
-        <w:rPr>
-          <w:rFonts w:ascii="Times New Roman" w:hAnsi="Times New Roman" w:eastAsia="Times New Roman"/>
-          <w:b w:val="0"/>
-          <w:i w:val="0"/>
-          <w:sz w:val="28"/>
-        </w:rPr>
-        <w:t>проверка по чек-листам качества требований;</w:t>
-      </w:r>
-    </w:p>
-    <w:p>
-      <w:pPr>
-        <w:pStyle w:val="ListBullet"/>
-        <w:spacing w:after="60"/>
-        <w:ind w:firstLine="0"/>
-        <w:jc w:val="both"/>
-      </w:pPr>
-      <w:r>
-        <w:rPr>
-          <w:rFonts w:ascii="Times New Roman" w:hAnsi="Times New Roman" w:eastAsia="Times New Roman"/>
-          <w:b w:val="0"/>
-          <w:i w:val="0"/>
-          <w:sz w:val="28"/>
-        </w:rPr>
-        <w:t>трассировка «требование → проектное решение → тест-кейс»;</w:t>
-      </w:r>
-    </w:p>
-    <w:p>
-      <w:pPr>
-        <w:pStyle w:val="ListBullet"/>
-        <w:spacing w:after="60"/>
-        <w:ind w:firstLine="0"/>
-        <w:jc w:val="both"/>
-      </w:pPr>
-      <w:r>
-        <w:rPr>
-          <w:rFonts w:ascii="Times New Roman" w:hAnsi="Times New Roman" w:eastAsia="Times New Roman"/>
-          <w:b w:val="0"/>
-          <w:i w:val="0"/>
-          <w:sz w:val="28"/>
-        </w:rPr>
-        <w:t>сравнение документации с фактическим поведением программного обеспечения;</w:t>
-      </w:r>
-    </w:p>
-    <w:p>
-      <w:pPr>
-        <w:pStyle w:val="ListBullet"/>
-        <w:spacing w:after="60"/>
-        <w:ind w:firstLine="0"/>
-        <w:jc w:val="both"/>
-      </w:pPr>
-      <w:r>
-        <w:rPr>
-          <w:rFonts w:ascii="Times New Roman" w:hAnsi="Times New Roman" w:eastAsia="Times New Roman"/>
-          <w:b w:val="0"/>
-          <w:i w:val="0"/>
-          <w:sz w:val="28"/>
-        </w:rPr>
-        <w:t>проверка актуальности примеров, скриншотов и описаний процедур.</w:t>
-      </w:r>
-    </w:p>
-    <w:p>
-      <w:pPr>
-        <w:spacing w:before="240" w:after="160"/>
-        <w:ind w:firstLine="0"/>
-        <w:jc w:val="left"/>
-      </w:pPr>
-      <w:r>
-        <w:rPr>
-          <w:rFonts w:ascii="Times New Roman" w:hAnsi="Times New Roman" w:eastAsia="Times New Roman"/>
-          <w:b/>
-          <w:i w:val="0"/>
-          <w:sz w:val="28"/>
-        </w:rPr>
-        <w:t>3. Нефункциональное тестирование: виды и характеристика</w:t>
-      </w:r>
-    </w:p>
-    <w:p>
-      <w:pPr>
-        <w:spacing w:after="120"/>
-        <w:ind w:firstLine="709"/>
-        <w:jc w:val="both"/>
-      </w:pPr>
-      <w:r>
-        <w:rPr>
-          <w:rFonts w:ascii="Times New Roman" w:hAnsi="Times New Roman" w:eastAsia="Times New Roman"/>
-          <w:b w:val="0"/>
-          <w:i w:val="0"/>
-          <w:sz w:val="28"/>
-        </w:rPr>
-        <w:t>Нефункциональное тестирование проверяет качественные характеристики системы — то, как она работает, а не только какие функции выполняет.</w:t>
+        <w:t>Проверяет, как система работает (качество), а не только что она делает.</w:t>
       </w:r>
     </w:p>
     <w:tbl>
@@ -1504,10 +815,9 @@
               <w:rPr>
                 <w:rFonts w:ascii="Times New Roman" w:hAnsi="Times New Roman" w:eastAsia="Times New Roman"/>
                 <w:b/>
-                <w:i w:val="0"/>
-                <w:sz w:val="24"/>
+                <w:sz w:val="22"/>
               </w:rPr>
-              <w:t>Вид тестирования</w:t>
+              <w:t>Вид</w:t>
             </w:r>
           </w:p>
         </w:tc>
@@ -1525,10 +835,9 @@
               <w:rPr>
                 <w:rFonts w:ascii="Times New Roman" w:hAnsi="Times New Roman" w:eastAsia="Times New Roman"/>
                 <w:b/>
-                <w:i w:val="0"/>
-                <w:sz w:val="24"/>
+                <w:sz w:val="22"/>
               </w:rPr>
-              <w:t>Характеристика</w:t>
+              <w:t>Суть</w:t>
             </w:r>
           </w:p>
         </w:tc>
@@ -1547,7 +856,6 @@
               <w:rPr>
                 <w:rFonts w:ascii="Times New Roman" w:hAnsi="Times New Roman" w:eastAsia="Times New Roman"/>
                 <w:b w:val="0"/>
-                <w:i w:val="0"/>
                 <w:sz w:val="22"/>
               </w:rPr>
               <w:t>Производительность</w:t>
@@ -1567,10 +875,9 @@
               <w:rPr>
                 <w:rFonts w:ascii="Times New Roman" w:hAnsi="Times New Roman" w:eastAsia="Times New Roman"/>
                 <w:b w:val="0"/>
-                <w:i w:val="0"/>
                 <w:sz w:val="22"/>
               </w:rPr>
-              <w:t>Оценка времени отклика и пропускной способности при нормальной нагрузке</w:t>
+              <w:t>Время отклика при нормальной нагрузке</w:t>
             </w:r>
           </w:p>
         </w:tc>
@@ -1589,7 +896,6 @@
               <w:rPr>
                 <w:rFonts w:ascii="Times New Roman" w:hAnsi="Times New Roman" w:eastAsia="Times New Roman"/>
                 <w:b w:val="0"/>
-                <w:i w:val="0"/>
                 <w:sz w:val="22"/>
               </w:rPr>
               <w:t>Нагрузочное</w:t>
@@ -1609,10 +915,9 @@
               <w:rPr>
                 <w:rFonts w:ascii="Times New Roman" w:hAnsi="Times New Roman" w:eastAsia="Times New Roman"/>
                 <w:b w:val="0"/>
-                <w:i w:val="0"/>
                 <w:sz w:val="22"/>
               </w:rPr>
-              <w:t>Поведение системы при ожидаемой и пиковой нагрузке</w:t>
+              <w:t>Ожидаемая/пиковая нагрузка</w:t>
             </w:r>
           </w:p>
         </w:tc>
@@ -1631,10 +936,9 @@
               <w:rPr>
                 <w:rFonts w:ascii="Times New Roman" w:hAnsi="Times New Roman" w:eastAsia="Times New Roman"/>
                 <w:b w:val="0"/>
-                <w:i w:val="0"/>
                 <w:sz w:val="22"/>
               </w:rPr>
-              <w:t>Стрессовое</w:t>
+              <w:t>Стресс</w:t>
             </w:r>
           </w:p>
         </w:tc>
@@ -1651,10 +955,9 @@
               <w:rPr>
                 <w:rFonts w:ascii="Times New Roman" w:hAnsi="Times New Roman" w:eastAsia="Times New Roman"/>
                 <w:b w:val="0"/>
-                <w:i w:val="0"/>
                 <w:sz w:val="22"/>
               </w:rPr>
-              <w:t>Работа за пределами нормы, поиск точек отказа и проверка восстановления</w:t>
+              <w:t>За пределами нормы, точка отказа</w:t>
             </w:r>
           </w:p>
         </w:tc>
@@ -1673,7 +976,6 @@
               <w:rPr>
                 <w:rFonts w:ascii="Times New Roman" w:hAnsi="Times New Roman" w:eastAsia="Times New Roman"/>
                 <w:b w:val="0"/>
-                <w:i w:val="0"/>
                 <w:sz w:val="22"/>
               </w:rPr>
               <w:t>Объёмное</w:t>
@@ -1693,10 +995,9 @@
               <w:rPr>
                 <w:rFonts w:ascii="Times New Roman" w:hAnsi="Times New Roman" w:eastAsia="Times New Roman"/>
                 <w:b w:val="0"/>
-                <w:i w:val="0"/>
                 <w:sz w:val="22"/>
               </w:rPr>
-              <w:t>Проверка при больших объёмах данных</w:t>
+              <w:t>Большие объёмы данных</w:t>
             </w:r>
           </w:p>
         </w:tc>
@@ -1715,10 +1016,9 @@
               <w:rPr>
                 <w:rFonts w:ascii="Times New Roman" w:hAnsi="Times New Roman" w:eastAsia="Times New Roman"/>
                 <w:b w:val="0"/>
-                <w:i w:val="0"/>
                 <w:sz w:val="22"/>
               </w:rPr>
-              <w:t>Стабильность (endurance)</w:t>
+              <w:t>Стабильность</w:t>
             </w:r>
           </w:p>
         </w:tc>
@@ -1735,10 +1035,9 @@
               <w:rPr>
                 <w:rFonts w:ascii="Times New Roman" w:hAnsi="Times New Roman" w:eastAsia="Times New Roman"/>
                 <w:b w:val="0"/>
-                <w:i w:val="0"/>
                 <w:sz w:val="22"/>
               </w:rPr>
-              <w:t>Длительная работа без деградации характеристик</w:t>
+              <w:t>Длительная работа без деградации</w:t>
             </w:r>
           </w:p>
         </w:tc>
@@ -1757,7 +1056,6 @@
               <w:rPr>
                 <w:rFonts w:ascii="Times New Roman" w:hAnsi="Times New Roman" w:eastAsia="Times New Roman"/>
                 <w:b w:val="0"/>
-                <w:i w:val="0"/>
                 <w:sz w:val="22"/>
               </w:rPr>
               <w:t>Безопасность</w:t>
@@ -1777,10 +1075,9 @@
               <w:rPr>
                 <w:rFonts w:ascii="Times New Roman" w:hAnsi="Times New Roman" w:eastAsia="Times New Roman"/>
                 <w:b w:val="0"/>
-                <w:i w:val="0"/>
                 <w:sz w:val="22"/>
               </w:rPr>
-              <w:t>Защита от несанкционированного доступа и уязвимостей</w:t>
+              <w:t>Защита от угроз и уязвимостей</w:t>
             </w:r>
           </w:p>
         </w:tc>
@@ -1799,7 +1096,6 @@
               <w:rPr>
                 <w:rFonts w:ascii="Times New Roman" w:hAnsi="Times New Roman" w:eastAsia="Times New Roman"/>
                 <w:b w:val="0"/>
-                <w:i w:val="0"/>
                 <w:sz w:val="22"/>
               </w:rPr>
               <w:t>Usability</w:t>
@@ -1819,10 +1115,9 @@
               <w:rPr>
                 <w:rFonts w:ascii="Times New Roman" w:hAnsi="Times New Roman" w:eastAsia="Times New Roman"/>
                 <w:b w:val="0"/>
-                <w:i w:val="0"/>
                 <w:sz w:val="22"/>
               </w:rPr>
-              <w:t>Удобство и понятность пользовательского интерфейса</w:t>
+              <w:t>Удобство интерфейса</w:t>
             </w:r>
           </w:p>
         </w:tc>
@@ -1841,7 +1136,6 @@
               <w:rPr>
                 <w:rFonts w:ascii="Times New Roman" w:hAnsi="Times New Roman" w:eastAsia="Times New Roman"/>
                 <w:b w:val="0"/>
-                <w:i w:val="0"/>
                 <w:sz w:val="22"/>
               </w:rPr>
               <w:t>Совместимость</w:t>
@@ -1861,136 +1155,9 @@
               <w:rPr>
                 <w:rFonts w:ascii="Times New Roman" w:hAnsi="Times New Roman" w:eastAsia="Times New Roman"/>
                 <w:b w:val="0"/>
-                <w:i w:val="0"/>
                 <w:sz w:val="22"/>
               </w:rPr>
-              <w:t>Корректная работа на разных ОС, браузерах, устройствах и версиях</w:t>
-            </w:r>
-          </w:p>
-        </w:tc>
-      </w:tr>
-      <w:tr>
-        <w:tc>
-          <w:tcPr>
-            <w:tcW w:type="dxa" w:w="4986"/>
-          </w:tcPr>
-          <w:p>
-            <w:pPr>
-              <w:jc w:val="left"/>
-            </w:pPr>
-            <w:r/>
-            <w:r>
-              <w:rPr>
-                <w:rFonts w:ascii="Times New Roman" w:hAnsi="Times New Roman" w:eastAsia="Times New Roman"/>
-                <w:b w:val="0"/>
-                <w:i w:val="0"/>
-                <w:sz w:val="22"/>
-              </w:rPr>
-              <w:t>Надёжность</w:t>
-            </w:r>
-          </w:p>
-        </w:tc>
-        <w:tc>
-          <w:tcPr>
-            <w:tcW w:type="dxa" w:w="4986"/>
-          </w:tcPr>
-          <w:p>
-            <w:pPr>
-              <w:jc w:val="left"/>
-            </w:pPr>
-            <w:r/>
-            <w:r>
-              <w:rPr>
-                <w:rFonts w:ascii="Times New Roman" w:hAnsi="Times New Roman" w:eastAsia="Times New Roman"/>
-                <w:b w:val="0"/>
-                <w:i w:val="0"/>
-                <w:sz w:val="22"/>
-              </w:rPr>
-              <w:t>Устойчивость к сбоям, показатели безотказной работы</w:t>
-            </w:r>
-          </w:p>
-        </w:tc>
-      </w:tr>
-      <w:tr>
-        <w:tc>
-          <w:tcPr>
-            <w:tcW w:type="dxa" w:w="4986"/>
-          </w:tcPr>
-          <w:p>
-            <w:pPr>
-              <w:jc w:val="left"/>
-            </w:pPr>
-            <w:r/>
-            <w:r>
-              <w:rPr>
-                <w:rFonts w:ascii="Times New Roman" w:hAnsi="Times New Roman" w:eastAsia="Times New Roman"/>
-                <w:b w:val="0"/>
-                <w:i w:val="0"/>
-                <w:sz w:val="22"/>
-              </w:rPr>
-              <w:t>Портируемость</w:t>
-            </w:r>
-          </w:p>
-        </w:tc>
-        <w:tc>
-          <w:tcPr>
-            <w:tcW w:type="dxa" w:w="4986"/>
-          </w:tcPr>
-          <w:p>
-            <w:pPr>
-              <w:jc w:val="left"/>
-            </w:pPr>
-            <w:r/>
-            <w:r>
-              <w:rPr>
-                <w:rFonts w:ascii="Times New Roman" w:hAnsi="Times New Roman" w:eastAsia="Times New Roman"/>
-                <w:b w:val="0"/>
-                <w:i w:val="0"/>
-                <w:sz w:val="22"/>
-              </w:rPr>
-              <w:t>Возможность переноса на другие платформы</w:t>
-            </w:r>
-          </w:p>
-        </w:tc>
-      </w:tr>
-      <w:tr>
-        <w:tc>
-          <w:tcPr>
-            <w:tcW w:type="dxa" w:w="4986"/>
-          </w:tcPr>
-          <w:p>
-            <w:pPr>
-              <w:jc w:val="left"/>
-            </w:pPr>
-            <w:r/>
-            <w:r>
-              <w:rPr>
-                <w:rFonts w:ascii="Times New Roman" w:hAnsi="Times New Roman" w:eastAsia="Times New Roman"/>
-                <w:b w:val="0"/>
-                <w:i w:val="0"/>
-                <w:sz w:val="22"/>
-              </w:rPr>
-              <w:t>Устанавливаемость</w:t>
-            </w:r>
-          </w:p>
-        </w:tc>
-        <w:tc>
-          <w:tcPr>
-            <w:tcW w:type="dxa" w:w="4986"/>
-          </w:tcPr>
-          <w:p>
-            <w:pPr>
-              <w:jc w:val="left"/>
-            </w:pPr>
-            <w:r/>
-            <w:r>
-              <w:rPr>
-                <w:rFonts w:ascii="Times New Roman" w:hAnsi="Times New Roman" w:eastAsia="Times New Roman"/>
-                <w:b w:val="0"/>
-                <w:i w:val="0"/>
-                <w:sz w:val="22"/>
-              </w:rPr>
-              <w:t>Корректность установки, обновления и удаления</w:t>
+              <w:t>ОС, браузеры, устройства</w:t>
             </w:r>
           </w:p>
         </w:tc>
@@ -2004,7 +1171,7 @@
     </w:p>
     <w:p>
       <w:pPr>
-        <w:spacing w:before="240" w:after="160"/>
+        <w:spacing w:before="200" w:after="120"/>
         <w:ind w:firstLine="0"/>
         <w:jc w:val="center"/>
       </w:pPr>
@@ -2012,7 +1179,6 @@
         <w:rPr>
           <w:rFonts w:ascii="Times New Roman" w:hAnsi="Times New Roman" w:eastAsia="Times New Roman"/>
           <w:b/>
-          <w:i w:val="0"/>
           <w:sz w:val="32"/>
         </w:rPr>
         <w:t>ВАРИАНТ 3</w:t>
@@ -2020,22 +1186,21 @@
     </w:p>
     <w:p>
       <w:pPr>
-        <w:spacing w:after="120" w:before="0"/>
+        <w:spacing w:after="80"/>
         <w:jc w:val="center"/>
       </w:pPr>
       <w:r>
         <w:rPr>
           <w:rFonts w:ascii="Times New Roman" w:hAnsi="Times New Roman" w:eastAsia="Times New Roman"/>
           <w:b w:val="0"/>
-          <w:i w:val="0"/>
-          <w:sz w:val="26"/>
+          <w:sz w:val="24"/>
         </w:rPr>
         <w:t>Учебный предмет: «Технология разработки программного обеспечения»</w:t>
       </w:r>
     </w:p>
     <w:p>
       <w:pPr>
-        <w:spacing w:before="240" w:after="160"/>
+        <w:spacing w:before="200" w:after="120"/>
         <w:ind w:firstLine="0"/>
         <w:jc w:val="left"/>
       </w:pPr>
@@ -2043,15 +1208,14 @@
         <w:rPr>
           <w:rFonts w:ascii="Times New Roman" w:hAnsi="Times New Roman" w:eastAsia="Times New Roman"/>
           <w:b/>
-          <w:i w:val="0"/>
           <w:sz w:val="28"/>
         </w:rPr>
-        <w:t>1. Понятие «Чек-лист». Отличие чек-листа от тест-кейса</w:t>
+        <w:t>1. Чек-лист. Отличие от тест-кейса</w:t>
       </w:r>
     </w:p>
     <w:p>
       <w:pPr>
-        <w:spacing w:after="120"/>
+        <w:spacing w:after="80"/>
         <w:ind w:firstLine="709"/>
         <w:jc w:val="both"/>
       </w:pPr>
@@ -2059,33 +1223,15 @@
         <w:rPr>
           <w:rFonts w:ascii="Times New Roman" w:hAnsi="Times New Roman" w:eastAsia="Times New Roman"/>
           <w:b w:val="0"/>
-          <w:i w:val="0"/>
           <w:sz w:val="28"/>
         </w:rPr>
-        <w:t>Чек-лист (checklist) — список пунктов (тезисов, вопросов или проверок), по которым проводится тестирование. Чек-лист, как правило, не содержит подробных пошаговых инструкций и жёстко формализованных ожидаемых результатов; он задаёт направления и области проверки.</w:t>
-      </w:r>
-    </w:p>
-    <w:p>
-      <w:pPr>
-        <w:spacing w:after="120"/>
-        <w:ind w:firstLine="709"/>
-        <w:jc w:val="both"/>
-      </w:pPr>
-      <w:r>
-        <w:rPr>
-          <w:rFonts w:ascii="Times New Roman" w:hAnsi="Times New Roman" w:eastAsia="Times New Roman"/>
-          <w:b w:val="0"/>
-          <w:i w:val="0"/>
-          <w:sz w:val="28"/>
-        </w:rPr>
-        <w:t>Основные отличия чек-листа от тест-кейса:</w:t>
+        <w:t>Чек-лист — список кратких пунктов для проверки без детальных шагов.</w:t>
       </w:r>
     </w:p>
     <w:tbl>
       <w:tblPr>
         <w:tblStyle w:val="TableGrid"/>
         <w:tblW w:type="auto" w:w="0"/>
-        <w:jc w:val="center"/>
         <w:tblLook w:firstColumn="1" w:firstRow="1" w:lastColumn="0" w:lastRow="0" w:noHBand="0" w:noVBand="1" w:val="04A0"/>
       </w:tblPr>
       <w:tblGrid>
@@ -2108,10 +1254,8 @@
               <w:rPr>
                 <w:rFonts w:ascii="Times New Roman" w:hAnsi="Times New Roman" w:eastAsia="Times New Roman"/>
                 <w:b/>
-                <w:i w:val="0"/>
-                <w:sz w:val="24"/>
+                <w:sz w:val="22"/>
               </w:rPr>
-              <w:t>Критерий</w:t>
             </w:r>
           </w:p>
         </w:tc>
@@ -2129,8 +1273,7 @@
               <w:rPr>
                 <w:rFonts w:ascii="Times New Roman" w:hAnsi="Times New Roman" w:eastAsia="Times New Roman"/>
                 <w:b/>
-                <w:i w:val="0"/>
-                <w:sz w:val="24"/>
+                <w:sz w:val="22"/>
               </w:rPr>
               <w:t>Чек-лист</w:t>
             </w:r>
@@ -2150,8 +1293,7 @@
               <w:rPr>
                 <w:rFonts w:ascii="Times New Roman" w:hAnsi="Times New Roman" w:eastAsia="Times New Roman"/>
                 <w:b/>
-                <w:i w:val="0"/>
-                <w:sz w:val="24"/>
+                <w:sz w:val="22"/>
               </w:rPr>
               <w:t>Тест-кейс</w:t>
             </w:r>
@@ -2172,7 +1314,6 @@
               <w:rPr>
                 <w:rFonts w:ascii="Times New Roman" w:hAnsi="Times New Roman" w:eastAsia="Times New Roman"/>
                 <w:b w:val="0"/>
-                <w:i w:val="0"/>
                 <w:sz w:val="22"/>
               </w:rPr>
               <w:t>Детализация</w:t>
@@ -2192,10 +1333,9 @@
               <w:rPr>
                 <w:rFonts w:ascii="Times New Roman" w:hAnsi="Times New Roman" w:eastAsia="Times New Roman"/>
                 <w:b w:val="0"/>
-                <w:i w:val="0"/>
                 <w:sz w:val="22"/>
               </w:rPr>
-              <w:t>Низкая: краткие пункты</w:t>
+              <w:t>Низкая</w:t>
             </w:r>
           </w:p>
         </w:tc>
@@ -2212,10 +1352,9 @@
               <w:rPr>
                 <w:rFonts w:ascii="Times New Roman" w:hAnsi="Times New Roman" w:eastAsia="Times New Roman"/>
                 <w:b w:val="0"/>
-                <w:i w:val="0"/>
                 <w:sz w:val="22"/>
               </w:rPr>
-              <w:t>Высокая: шаги, данные, ожидаемый результат</w:t>
+              <w:t>Высокая (шаги, данные, ожидаемый результат)</w:t>
             </w:r>
           </w:p>
         </w:tc>
@@ -2234,10 +1373,9 @@
               <w:rPr>
                 <w:rFonts w:ascii="Times New Roman" w:hAnsi="Times New Roman" w:eastAsia="Times New Roman"/>
                 <w:b w:val="0"/>
-                <w:i w:val="0"/>
                 <w:sz w:val="22"/>
               </w:rPr>
-              <w:t>Время подготовки</w:t>
+              <w:t>Подготовка</w:t>
             </w:r>
           </w:p>
         </w:tc>
@@ -2254,10 +1392,9 @@
               <w:rPr>
                 <w:rFonts w:ascii="Times New Roman" w:hAnsi="Times New Roman" w:eastAsia="Times New Roman"/>
                 <w:b w:val="0"/>
-                <w:i w:val="0"/>
                 <w:sz w:val="22"/>
               </w:rPr>
-              <w:t>Небольшое</w:t>
+              <w:t>Быстро</w:t>
             </w:r>
           </w:p>
         </w:tc>
@@ -2274,10 +1411,9 @@
               <w:rPr>
                 <w:rFonts w:ascii="Times New Roman" w:hAnsi="Times New Roman" w:eastAsia="Times New Roman"/>
                 <w:b w:val="0"/>
-                <w:i w:val="0"/>
                 <w:sz w:val="22"/>
               </w:rPr>
-              <w:t>Существенно больше</w:t>
+              <w:t>Дольше</w:t>
             </w:r>
           </w:p>
         </w:tc>
@@ -2296,7 +1432,6 @@
               <w:rPr>
                 <w:rFonts w:ascii="Times New Roman" w:hAnsi="Times New Roman" w:eastAsia="Times New Roman"/>
                 <w:b w:val="0"/>
-                <w:i w:val="0"/>
                 <w:sz w:val="22"/>
               </w:rPr>
               <w:t>Повторяемость</w:t>
@@ -2316,7 +1451,6 @@
               <w:rPr>
                 <w:rFonts w:ascii="Times New Roman" w:hAnsi="Times New Roman" w:eastAsia="Times New Roman"/>
                 <w:b w:val="0"/>
-                <w:i w:val="0"/>
                 <w:sz w:val="22"/>
               </w:rPr>
               <w:t>Зависит от исполнителя</w:t>
@@ -2336,10 +1470,9 @@
               <w:rPr>
                 <w:rFonts w:ascii="Times New Roman" w:hAnsi="Times New Roman" w:eastAsia="Times New Roman"/>
                 <w:b w:val="0"/>
-                <w:i w:val="0"/>
                 <w:sz w:val="22"/>
               </w:rPr>
-              <w:t>Выше за счёт формализации</w:t>
+              <w:t>Выше</w:t>
             </w:r>
           </w:p>
         </w:tc>
@@ -2358,10 +1491,9 @@
               <w:rPr>
                 <w:rFonts w:ascii="Times New Roman" w:hAnsi="Times New Roman" w:eastAsia="Times New Roman"/>
                 <w:b w:val="0"/>
-                <w:i w:val="0"/>
                 <w:sz w:val="22"/>
               </w:rPr>
-              <w:t>Учёт и трассировка</w:t>
+              <w:t>Применение</w:t>
             </w:r>
           </w:p>
         </w:tc>
@@ -2378,10 +1510,9 @@
               <w:rPr>
                 <w:rFonts w:ascii="Times New Roman" w:hAnsi="Times New Roman" w:eastAsia="Times New Roman"/>
                 <w:b w:val="0"/>
-                <w:i w:val="0"/>
                 <w:sz w:val="22"/>
               </w:rPr>
-              <w:t>Обычно слабее</w:t>
+              <w:t>Smoke, exploratory</w:t>
             </w:r>
           </w:p>
         </w:tc>
@@ -2398,134 +1529,9 @@
               <w:rPr>
                 <w:rFonts w:ascii="Times New Roman" w:hAnsi="Times New Roman" w:eastAsia="Times New Roman"/>
                 <w:b w:val="0"/>
-                <w:i w:val="0"/>
                 <w:sz w:val="22"/>
               </w:rPr>
-              <w:t>Лучше: ID, статусы, связь с требованиями</w:t>
-            </w:r>
-          </w:p>
-        </w:tc>
-      </w:tr>
-      <w:tr>
-        <w:tc>
-          <w:tcPr>
-            <w:tcW w:type="dxa" w:w="3324"/>
-          </w:tcPr>
-          <w:p>
-            <w:pPr>
-              <w:jc w:val="left"/>
-            </w:pPr>
-            <w:r/>
-            <w:r>
-              <w:rPr>
-                <w:rFonts w:ascii="Times New Roman" w:hAnsi="Times New Roman" w:eastAsia="Times New Roman"/>
-                <w:b w:val="0"/>
-                <w:i w:val="0"/>
-                <w:sz w:val="22"/>
-              </w:rPr>
-              <w:t>Область применения</w:t>
-            </w:r>
-          </w:p>
-        </w:tc>
-        <w:tc>
-          <w:tcPr>
-            <w:tcW w:type="dxa" w:w="3324"/>
-          </w:tcPr>
-          <w:p>
-            <w:pPr>
-              <w:jc w:val="left"/>
-            </w:pPr>
-            <w:r/>
-            <w:r>
-              <w:rPr>
-                <w:rFonts w:ascii="Times New Roman" w:hAnsi="Times New Roman" w:eastAsia="Times New Roman"/>
-                <w:b w:val="0"/>
-                <w:i w:val="0"/>
-                <w:sz w:val="22"/>
-              </w:rPr>
-              <w:t>Exploratory, smoke, быстрый регресс</w:t>
-            </w:r>
-          </w:p>
-        </w:tc>
-        <w:tc>
-          <w:tcPr>
-            <w:tcW w:type="dxa" w:w="3324"/>
-          </w:tcPr>
-          <w:p>
-            <w:pPr>
-              <w:jc w:val="left"/>
-            </w:pPr>
-            <w:r/>
-            <w:r>
-              <w:rPr>
-                <w:rFonts w:ascii="Times New Roman" w:hAnsi="Times New Roman" w:eastAsia="Times New Roman"/>
-                <w:b w:val="0"/>
-                <w:i w:val="0"/>
-                <w:sz w:val="22"/>
-              </w:rPr>
-              <w:t>Формальная приёмка, сложные сценарии, аудит</w:t>
-            </w:r>
-          </w:p>
-        </w:tc>
-      </w:tr>
-      <w:tr>
-        <w:tc>
-          <w:tcPr>
-            <w:tcW w:type="dxa" w:w="3324"/>
-          </w:tcPr>
-          <w:p>
-            <w:pPr>
-              <w:jc w:val="left"/>
-            </w:pPr>
-            <w:r/>
-            <w:r>
-              <w:rPr>
-                <w:rFonts w:ascii="Times New Roman" w:hAnsi="Times New Roman" w:eastAsia="Times New Roman"/>
-                <w:b w:val="0"/>
-                <w:i w:val="0"/>
-                <w:sz w:val="22"/>
-              </w:rPr>
-              <w:t>Фиксация результата</w:t>
-            </w:r>
-          </w:p>
-        </w:tc>
-        <w:tc>
-          <w:tcPr>
-            <w:tcW w:type="dxa" w:w="3324"/>
-          </w:tcPr>
-          <w:p>
-            <w:pPr>
-              <w:jc w:val="left"/>
-            </w:pPr>
-            <w:r/>
-            <w:r>
-              <w:rPr>
-                <w:rFonts w:ascii="Times New Roman" w:hAnsi="Times New Roman" w:eastAsia="Times New Roman"/>
-                <w:b w:val="0"/>
-                <w:i w:val="0"/>
-                <w:sz w:val="22"/>
-              </w:rPr>
-              <w:t>Часто отметка «выполнено»</w:t>
-            </w:r>
-          </w:p>
-        </w:tc>
-        <w:tc>
-          <w:tcPr>
-            <w:tcW w:type="dxa" w:w="3324"/>
-          </w:tcPr>
-          <w:p>
-            <w:pPr>
-              <w:jc w:val="left"/>
-            </w:pPr>
-            <w:r/>
-            <w:r>
-              <w:rPr>
-                <w:rFonts w:ascii="Times New Roman" w:hAnsi="Times New Roman" w:eastAsia="Times New Roman"/>
-                <w:b w:val="0"/>
-                <w:i w:val="0"/>
-                <w:sz w:val="22"/>
-              </w:rPr>
-              <w:t>Pass/Fail с доказательствами</w:t>
+              <w:t>Приёмка, сложные сценарии</w:t>
             </w:r>
           </w:p>
         </w:tc>
@@ -2534,7 +1540,22 @@
     <w:p/>
     <w:p>
       <w:pPr>
-        <w:spacing w:after="120"/>
+        <w:spacing w:before="200" w:after="120"/>
+        <w:ind w:firstLine="0"/>
+        <w:jc w:val="left"/>
+      </w:pPr>
+      <w:r>
+        <w:rPr>
+          <w:rFonts w:ascii="Times New Roman" w:hAnsi="Times New Roman" w:eastAsia="Times New Roman"/>
+          <w:b/>
+          <w:sz w:val="28"/>
+        </w:rPr>
+        <w:t>2. Жизненный цикл тестирования и бага</w:t>
+      </w:r>
+    </w:p>
+    <w:p>
+      <w:pPr>
+        <w:spacing w:after="80"/>
         <w:ind w:firstLine="709"/>
         <w:jc w:val="both"/>
       </w:pPr>
@@ -2542,15 +1563,29 @@
         <w:rPr>
           <w:rFonts w:ascii="Times New Roman" w:hAnsi="Times New Roman" w:eastAsia="Times New Roman"/>
           <w:b w:val="0"/>
-          <w:i w:val="0"/>
           <w:sz w:val="28"/>
         </w:rPr>
-        <w:t>Таким образом, чек-лист удобен для быстрых и гибких проверок, а тест-кейс — для детальной, воспроизводимой и формально документированной проверки.</w:t>
+        <w:t>STLC: анализ требований → планирование → разработка тестов → подготовка окружения → выполнение → отчётность и закрытие.</w:t>
       </w:r>
     </w:p>
     <w:p>
       <w:pPr>
-        <w:spacing w:before="240" w:after="160"/>
+        <w:spacing w:after="80"/>
+        <w:ind w:firstLine="709"/>
+        <w:jc w:val="both"/>
+      </w:pPr>
+      <w:r>
+        <w:rPr>
+          <w:rFonts w:ascii="Times New Roman" w:hAnsi="Times New Roman" w:eastAsia="Times New Roman"/>
+          <w:b w:val="0"/>
+          <w:sz w:val="28"/>
+        </w:rPr>
+        <w:t>Жизненный цикл бага: New → Assigned → In Progress → Fixed → Retest → Closed / Reopened. Критичные незакрытые дефекты блокируют релиз.</w:t>
+      </w:r>
+    </w:p>
+    <w:p>
+      <w:pPr>
+        <w:spacing w:before="200" w:after="120"/>
         <w:ind w:firstLine="0"/>
         <w:jc w:val="left"/>
       </w:pPr>
@@ -2558,305 +1593,99 @@
         <w:rPr>
           <w:rFonts w:ascii="Times New Roman" w:hAnsi="Times New Roman" w:eastAsia="Times New Roman"/>
           <w:b/>
-          <w:i w:val="0"/>
           <w:sz w:val="28"/>
         </w:rPr>
-        <w:t>2. Жизненный цикл тестирования. Жизненный цикл бага</w:t>
+        <w:t>3. Виды нагрузочного тестирования</w:t>
       </w:r>
     </w:p>
     <w:p>
       <w:pPr>
-        <w:spacing w:after="120"/>
-        <w:ind w:firstLine="709"/>
+        <w:pStyle w:val="ListBullet"/>
+        <w:spacing w:after="40"/>
         <w:jc w:val="both"/>
       </w:pPr>
       <w:r>
         <w:rPr>
           <w:rFonts w:ascii="Times New Roman" w:hAnsi="Times New Roman" w:eastAsia="Times New Roman"/>
           <w:b w:val="0"/>
-          <w:i w:val="0"/>
           <w:sz w:val="28"/>
         </w:rPr>
-        <w:t>Жизненный цикл тестирования (STLC — Software Testing Life Cycle) — упорядоченная последовательность этапов организации и проведения тестирования:</w:t>
+        <w:t>Load — ожидаемая нагрузка, время отклика и ошибки.</w:t>
       </w:r>
     </w:p>
     <w:p>
       <w:pPr>
-        <w:pStyle w:val="ListNumber"/>
-        <w:spacing w:after="60"/>
+        <w:pStyle w:val="ListBullet"/>
+        <w:spacing w:after="40"/>
         <w:jc w:val="both"/>
       </w:pPr>
       <w:r>
         <w:rPr>
           <w:rFonts w:ascii="Times New Roman" w:hAnsi="Times New Roman" w:eastAsia="Times New Roman"/>
           <w:b w:val="0"/>
-          <w:i w:val="0"/>
           <w:sz w:val="28"/>
         </w:rPr>
-        <w:t>Анализ требований — изучение того, что нужно проверить, выявление рисков и тестируемых аспектов.</w:t>
+        <w:t>Stress — выше нормы до отказа.</w:t>
       </w:r>
     </w:p>
     <w:p>
       <w:pPr>
-        <w:pStyle w:val="ListNumber"/>
-        <w:spacing w:after="60"/>
+        <w:pStyle w:val="ListBullet"/>
+        <w:spacing w:after="40"/>
         <w:jc w:val="both"/>
       </w:pPr>
       <w:r>
         <w:rPr>
           <w:rFonts w:ascii="Times New Roman" w:hAnsi="Times New Roman" w:eastAsia="Times New Roman"/>
           <w:b w:val="0"/>
-          <w:i w:val="0"/>
           <w:sz w:val="28"/>
         </w:rPr>
-        <w:t>Планирование тестирования — определение стратегии, объёма, ресурсов, сроков, критериев входа/выхода.</w:t>
+        <w:t>Spike — резкие всплески нагрузки.</w:t>
       </w:r>
     </w:p>
     <w:p>
       <w:pPr>
-        <w:pStyle w:val="ListNumber"/>
-        <w:spacing w:after="60"/>
+        <w:pStyle w:val="ListBullet"/>
+        <w:spacing w:after="40"/>
         <w:jc w:val="both"/>
       </w:pPr>
       <w:r>
         <w:rPr>
           <w:rFonts w:ascii="Times New Roman" w:hAnsi="Times New Roman" w:eastAsia="Times New Roman"/>
           <w:b w:val="0"/>
-          <w:i w:val="0"/>
           <w:sz w:val="28"/>
         </w:rPr>
-        <w:t>Разработка тест-кейсов и чек-листов — подготовка проверок и трассировка к требованиям.</w:t>
+        <w:t>Volume — большие объёмы данных.</w:t>
       </w:r>
     </w:p>
     <w:p>
       <w:pPr>
-        <w:pStyle w:val="ListNumber"/>
-        <w:spacing w:after="60"/>
+        <w:pStyle w:val="ListBullet"/>
+        <w:spacing w:after="40"/>
         <w:jc w:val="both"/>
       </w:pPr>
       <w:r>
         <w:rPr>
           <w:rFonts w:ascii="Times New Roman" w:hAnsi="Times New Roman" w:eastAsia="Times New Roman"/>
           <w:b w:val="0"/>
-          <w:i w:val="0"/>
           <w:sz w:val="28"/>
         </w:rPr>
-        <w:t>Подготовка тестового окружения и данных — настройка стендов, учётных записей, наборов данных.</w:t>
+        <w:t>Endurance (soak) — длительная нагрузка, утечки памяти.</w:t>
       </w:r>
     </w:p>
     <w:p>
       <w:pPr>
-        <w:pStyle w:val="ListNumber"/>
-        <w:spacing w:after="60"/>
+        <w:pStyle w:val="ListBullet"/>
+        <w:spacing w:after="40"/>
         <w:jc w:val="both"/>
       </w:pPr>
       <w:r>
         <w:rPr>
           <w:rFonts w:ascii="Times New Roman" w:hAnsi="Times New Roman" w:eastAsia="Times New Roman"/>
           <w:b w:val="0"/>
-          <w:i w:val="0"/>
           <w:sz w:val="28"/>
         </w:rPr>
-        <w:t>Выполнение тестирования — прогон тестов, фиксация результатов, регистрация дефектов.</w:t>
-      </w:r>
-    </w:p>
-    <w:p>
-      <w:pPr>
-        <w:pStyle w:val="ListNumber"/>
-        <w:spacing w:after="60"/>
-        <w:jc w:val="both"/>
-      </w:pPr>
-      <w:r>
-        <w:rPr>
-          <w:rFonts w:ascii="Times New Roman" w:hAnsi="Times New Roman" w:eastAsia="Times New Roman"/>
-          <w:b w:val="0"/>
-          <w:i w:val="0"/>
-          <w:sz w:val="28"/>
-        </w:rPr>
-        <w:t>Отчётность и закрытие цикла — анализ метрик, оценка качества, lessons learned, архивация артефактов.</w:t>
-      </w:r>
-    </w:p>
-    <w:p>
-      <w:pPr>
-        <w:spacing w:after="120"/>
-        <w:ind w:firstLine="709"/>
-        <w:jc w:val="both"/>
-      </w:pPr>
-      <w:r>
-        <w:rPr>
-          <w:rFonts w:ascii="Times New Roman" w:hAnsi="Times New Roman" w:eastAsia="Times New Roman"/>
-          <w:b w:val="0"/>
-          <w:i w:val="0"/>
-          <w:sz w:val="28"/>
-        </w:rPr>
-        <w:t>Жизненный цикл бага (дефекта) связан с этапом выполнения тестирования и обычно включает статусы: New → Assigned → In Progress → Fixed/Resolved → Retest → Closed. При неуспешной проверке дефект может быть переоткрыт (Reopened). Также возможны статусы Rejected, Deferred, Won’t Fix.</w:t>
-      </w:r>
-    </w:p>
-    <w:p>
-      <w:pPr>
-        <w:spacing w:after="120"/>
-        <w:ind w:firstLine="709"/>
-        <w:jc w:val="both"/>
-      </w:pPr>
-      <w:r>
-        <w:rPr>
-          <w:rFonts w:ascii="Times New Roman" w:hAnsi="Times New Roman" w:eastAsia="Times New Roman"/>
-          <w:b w:val="0"/>
-          <w:i w:val="0"/>
-          <w:sz w:val="28"/>
-        </w:rPr>
-        <w:t>Связь циклов: в ходе выполнения STLC обнаруженные дефекты проходят собственный жизненный цикл до закрытия. Критичные незакрытые дефекты, как правило, блокируют релиз.</w:t>
-      </w:r>
-    </w:p>
-    <w:p>
-      <w:pPr>
-        <w:spacing w:before="240" w:after="160"/>
-        <w:ind w:firstLine="0"/>
-        <w:jc w:val="left"/>
-      </w:pPr>
-      <w:r>
-        <w:rPr>
-          <w:rFonts w:ascii="Times New Roman" w:hAnsi="Times New Roman" w:eastAsia="Times New Roman"/>
-          <w:b/>
-          <w:i w:val="0"/>
-          <w:sz w:val="28"/>
-        </w:rPr>
-        <w:t>3. Основные виды нагрузочного тестирования. Характеристика</w:t>
-      </w:r>
-    </w:p>
-    <w:p>
-      <w:pPr>
-        <w:spacing w:after="120"/>
-        <w:ind w:firstLine="709"/>
-        <w:jc w:val="both"/>
-      </w:pPr>
-      <w:r>
-        <w:rPr>
-          <w:rFonts w:ascii="Times New Roman" w:hAnsi="Times New Roman" w:eastAsia="Times New Roman"/>
-          <w:b w:val="0"/>
-          <w:i w:val="0"/>
-          <w:sz w:val="28"/>
-        </w:rPr>
-        <w:t>Нагрузочное тестирование в широком смысле относится к проверке производительности системы под нагрузкой. Основные виды:</w:t>
-      </w:r>
-    </w:p>
-    <w:p>
-      <w:pPr>
-        <w:pStyle w:val="ListBullet"/>
-        <w:spacing w:after="60"/>
-        <w:ind w:firstLine="0"/>
-        <w:jc w:val="both"/>
-      </w:pPr>
-      <w:r>
-        <w:rPr>
-          <w:rFonts w:ascii="Times New Roman" w:hAnsi="Times New Roman" w:eastAsia="Times New Roman"/>
-          <w:b w:val="0"/>
-          <w:i w:val="0"/>
-          <w:sz w:val="28"/>
-        </w:rPr>
-        <w:t>Load testing (нагрузочное) — проверка поведения системы при ожидаемой (согласованной) нагрузке: число пользователей, запросов в секунду. Оцениваются время отклика, пропускная способность и процент ошибок.</w:t>
-      </w:r>
-    </w:p>
-    <w:p>
-      <w:pPr>
-        <w:pStyle w:val="ListBullet"/>
-        <w:spacing w:after="60"/>
-        <w:ind w:firstLine="0"/>
-        <w:jc w:val="both"/>
-      </w:pPr>
-      <w:r>
-        <w:rPr>
-          <w:rFonts w:ascii="Times New Roman" w:hAnsi="Times New Roman" w:eastAsia="Times New Roman"/>
-          <w:b w:val="0"/>
-          <w:i w:val="0"/>
-          <w:sz w:val="28"/>
-        </w:rPr>
-        <w:t>Stress testing (стрессовое) — нагрузка выше нормы вплоть до отказа. Цель — найти предел системы и проверить поведение при перегрузке и восстановлении.</w:t>
-      </w:r>
-    </w:p>
-    <w:p>
-      <w:pPr>
-        <w:pStyle w:val="ListBullet"/>
-        <w:spacing w:after="60"/>
-        <w:ind w:firstLine="0"/>
-        <w:jc w:val="both"/>
-      </w:pPr>
-      <w:r>
-        <w:rPr>
-          <w:rFonts w:ascii="Times New Roman" w:hAnsi="Times New Roman" w:eastAsia="Times New Roman"/>
-          <w:b w:val="0"/>
-          <w:i w:val="0"/>
-          <w:sz w:val="28"/>
-        </w:rPr>
-        <w:t>Spike testing — проверка реакции на резкие кратковременные всплески нагрузки.</w:t>
-      </w:r>
-    </w:p>
-    <w:p>
-      <w:pPr>
-        <w:pStyle w:val="ListBullet"/>
-        <w:spacing w:after="60"/>
-        <w:ind w:firstLine="0"/>
-        <w:jc w:val="both"/>
-      </w:pPr>
-      <w:r>
-        <w:rPr>
-          <w:rFonts w:ascii="Times New Roman" w:hAnsi="Times New Roman" w:eastAsia="Times New Roman"/>
-          <w:b w:val="0"/>
-          <w:i w:val="0"/>
-          <w:sz w:val="28"/>
-        </w:rPr>
-        <w:t>Volume testing (объёмное) — проверка при больших объёмах данных (записи в БД, файлы), а не только при большом числе пользователей.</w:t>
-      </w:r>
-    </w:p>
-    <w:p>
-      <w:pPr>
-        <w:pStyle w:val="ListBullet"/>
-        <w:spacing w:after="60"/>
-        <w:ind w:firstLine="0"/>
-        <w:jc w:val="both"/>
-      </w:pPr>
-      <w:r>
-        <w:rPr>
-          <w:rFonts w:ascii="Times New Roman" w:hAnsi="Times New Roman" w:eastAsia="Times New Roman"/>
-          <w:b w:val="0"/>
-          <w:i w:val="0"/>
-          <w:sz w:val="28"/>
-        </w:rPr>
-        <w:t>Endurance / soak testing (на стабильность) — длительная нагрузка средней интенсивности для выявления утечек памяти и деградации производительности.</w:t>
-      </w:r>
-    </w:p>
-    <w:p>
-      <w:pPr>
-        <w:pStyle w:val="ListBullet"/>
-        <w:spacing w:after="60"/>
-        <w:ind w:firstLine="0"/>
-        <w:jc w:val="both"/>
-      </w:pPr>
-      <w:r>
-        <w:rPr>
-          <w:rFonts w:ascii="Times New Roman" w:hAnsi="Times New Roman" w:eastAsia="Times New Roman"/>
-          <w:b w:val="0"/>
-          <w:i w:val="0"/>
-          <w:sz w:val="28"/>
-        </w:rPr>
-        <w:t>Scalability testing — оценка изменения производительности при масштабировании ресурсов (горизонтальном или вертикальном).</w:t>
-      </w:r>
-    </w:p>
-    <w:p>
-      <w:pPr>
-        <w:pStyle w:val="ListBullet"/>
-        <w:spacing w:after="60"/>
-        <w:ind w:firstLine="0"/>
-        <w:jc w:val="both"/>
-      </w:pPr>
-      <w:r>
-        <w:rPr>
-          <w:rFonts w:ascii="Times New Roman" w:hAnsi="Times New Roman" w:eastAsia="Times New Roman"/>
-          <w:b w:val="0"/>
-          <w:i w:val="0"/>
-          <w:sz w:val="28"/>
-        </w:rPr>
-        <w:t>Capacity testing — определение максимальной полезной ёмкости системы при соблюдении заданных SLA.</w:t>
+        <w:t>Scalability / Capacity — масштабирование и максимальная ёмкость при SLA.</w:t>
       </w:r>
     </w:p>
     <w:p>
@@ -2866,7 +1695,7 @@
     </w:p>
     <w:p>
       <w:pPr>
-        <w:spacing w:before="240" w:after="160"/>
+        <w:spacing w:before="200" w:after="120"/>
         <w:ind w:firstLine="0"/>
         <w:jc w:val="center"/>
       </w:pPr>
@@ -2874,7 +1703,6 @@
         <w:rPr>
           <w:rFonts w:ascii="Times New Roman" w:hAnsi="Times New Roman" w:eastAsia="Times New Roman"/>
           <w:b/>
-          <w:i w:val="0"/>
           <w:sz w:val="32"/>
         </w:rPr>
         <w:t>ВАРИАНТ 4</w:t>
@@ -2882,22 +1710,21 @@
     </w:p>
     <w:p>
       <w:pPr>
-        <w:spacing w:after="120" w:before="0"/>
+        <w:spacing w:after="80"/>
         <w:jc w:val="center"/>
       </w:pPr>
       <w:r>
         <w:rPr>
           <w:rFonts w:ascii="Times New Roman" w:hAnsi="Times New Roman" w:eastAsia="Times New Roman"/>
           <w:b w:val="0"/>
-          <w:i w:val="0"/>
-          <w:sz w:val="26"/>
+          <w:sz w:val="24"/>
         </w:rPr>
         <w:t>Учебный предмет: «Технология разработки программного обеспечения»</w:t>
       </w:r>
     </w:p>
     <w:p>
       <w:pPr>
-        <w:spacing w:before="240" w:after="160"/>
+        <w:spacing w:before="200" w:after="120"/>
         <w:ind w:firstLine="0"/>
         <w:jc w:val="left"/>
       </w:pPr>
@@ -2905,7 +1732,6 @@
         <w:rPr>
           <w:rFonts w:ascii="Times New Roman" w:hAnsi="Times New Roman" w:eastAsia="Times New Roman"/>
           <w:b/>
-          <w:i w:val="0"/>
           <w:sz w:val="28"/>
         </w:rPr>
         <w:t>1. Тестирование безопасности. Виды уязвимостей</w:t>
@@ -2913,7 +1739,7 @@
     </w:p>
     <w:p>
       <w:pPr>
-        <w:spacing w:after="120"/>
+        <w:spacing w:after="80"/>
         <w:ind w:firstLine="709"/>
         <w:jc w:val="both"/>
       </w:pPr>
@@ -2921,15 +1747,14 @@
         <w:rPr>
           <w:rFonts w:ascii="Times New Roman" w:hAnsi="Times New Roman" w:eastAsia="Times New Roman"/>
           <w:b w:val="0"/>
-          <w:i w:val="0"/>
           <w:sz w:val="28"/>
         </w:rPr>
-        <w:t>Тестирование безопасности (security testing) — вид тестирования, направленный на проверку защищённости программного обеспечения от угроз: несанкционированного доступа, утечки и искажения данных, повышения привилегий, отказа в обслуживании и других атак. В рамках тестирования безопасности проверяют механизмы аутентификации и авторизации, обработку входных данных, конфигурацию, шифрование, журналирование и защиту каналов связи.</w:t>
+        <w:t>Тестирование безопасности — проверка защищённости ПО: аутентификация, авторизация, обработка ввода, конфигурация, шифрование, логирование.</w:t>
       </w:r>
     </w:p>
     <w:p>
       <w:pPr>
-        <w:spacing w:after="120"/>
+        <w:spacing w:after="80"/>
         <w:ind w:firstLine="709"/>
         <w:jc w:val="both"/>
       </w:pPr>
@@ -2937,202 +1762,14 @@
         <w:rPr>
           <w:rFonts w:ascii="Times New Roman" w:hAnsi="Times New Roman" w:eastAsia="Times New Roman"/>
           <w:b w:val="0"/>
-          <w:i w:val="0"/>
           <w:sz w:val="28"/>
         </w:rPr>
-        <w:t>Основные виды уязвимостей (в том числе по классификации OWASP):</w:t>
+        <w:t>Уязвимости: инъекции (SQL, XSS); слабая аутентификация; нарушения доступа (IDOR); небезопасная конфигурация; утечка данных; CSRF; уязвимые компоненты; DoS; небезопасная десериализация; path traversal.</w:t>
       </w:r>
     </w:p>
     <w:p>
       <w:pPr>
-        <w:pStyle w:val="ListBullet"/>
-        <w:spacing w:after="60"/>
-        <w:ind w:firstLine="0"/>
-        <w:jc w:val="both"/>
-      </w:pPr>
-      <w:r>
-        <w:rPr>
-          <w:rFonts w:ascii="Times New Roman" w:hAnsi="Times New Roman" w:eastAsia="Times New Roman"/>
-          <w:b w:val="0"/>
-          <w:i w:val="0"/>
-          <w:sz w:val="28"/>
-        </w:rPr>
-        <w:t>инъекции (SQL Injection, XSS, Command Injection и др.);</w:t>
-      </w:r>
-    </w:p>
-    <w:p>
-      <w:pPr>
-        <w:pStyle w:val="ListBullet"/>
-        <w:spacing w:after="60"/>
-        <w:ind w:firstLine="0"/>
-        <w:jc w:val="both"/>
-      </w:pPr>
-      <w:r>
-        <w:rPr>
-          <w:rFonts w:ascii="Times New Roman" w:hAnsi="Times New Roman" w:eastAsia="Times New Roman"/>
-          <w:b w:val="0"/>
-          <w:i w:val="0"/>
-          <w:sz w:val="28"/>
-        </w:rPr>
-        <w:t>нарушения аутентификации (слабые пароли, управление сессиями, session hijacking);</w:t>
-      </w:r>
-    </w:p>
-    <w:p>
-      <w:pPr>
-        <w:pStyle w:val="ListBullet"/>
-        <w:spacing w:after="60"/>
-        <w:ind w:firstLine="0"/>
-        <w:jc w:val="both"/>
-      </w:pPr>
-      <w:r>
-        <w:rPr>
-          <w:rFonts w:ascii="Times New Roman" w:hAnsi="Times New Roman" w:eastAsia="Times New Roman"/>
-          <w:b w:val="0"/>
-          <w:i w:val="0"/>
-          <w:sz w:val="28"/>
-        </w:rPr>
-        <w:t>нарушения контроля доступа (IDOR, повышение привилегий);</w:t>
-      </w:r>
-    </w:p>
-    <w:p>
-      <w:pPr>
-        <w:pStyle w:val="ListBullet"/>
-        <w:spacing w:after="60"/>
-        <w:ind w:firstLine="0"/>
-        <w:jc w:val="both"/>
-      </w:pPr>
-      <w:r>
-        <w:rPr>
-          <w:rFonts w:ascii="Times New Roman" w:hAnsi="Times New Roman" w:eastAsia="Times New Roman"/>
-          <w:b w:val="0"/>
-          <w:i w:val="0"/>
-          <w:sz w:val="28"/>
-        </w:rPr>
-        <w:t>небезопасная конфигурация системы и окружения;</w:t>
-      </w:r>
-    </w:p>
-    <w:p>
-      <w:pPr>
-        <w:pStyle w:val="ListBullet"/>
-        <w:spacing w:after="60"/>
-        <w:ind w:firstLine="0"/>
-        <w:jc w:val="both"/>
-      </w:pPr>
-      <w:r>
-        <w:rPr>
-          <w:rFonts w:ascii="Times New Roman" w:hAnsi="Times New Roman" w:eastAsia="Times New Roman"/>
-          <w:b w:val="0"/>
-          <w:i w:val="0"/>
-          <w:sz w:val="28"/>
-        </w:rPr>
-        <w:t>утечка чувствительных данных;</w:t>
-      </w:r>
-    </w:p>
-    <w:p>
-      <w:pPr>
-        <w:pStyle w:val="ListBullet"/>
-        <w:spacing w:after="60"/>
-        <w:ind w:firstLine="0"/>
-        <w:jc w:val="both"/>
-      </w:pPr>
-      <w:r>
-        <w:rPr>
-          <w:rFonts w:ascii="Times New Roman" w:hAnsi="Times New Roman" w:eastAsia="Times New Roman"/>
-          <w:b w:val="0"/>
-          <w:i w:val="0"/>
-          <w:sz w:val="28"/>
-        </w:rPr>
-        <w:t>недостаточная защита API и массовое назначение параметров;</w:t>
-      </w:r>
-    </w:p>
-    <w:p>
-      <w:pPr>
-        <w:pStyle w:val="ListBullet"/>
-        <w:spacing w:after="60"/>
-        <w:ind w:firstLine="0"/>
-        <w:jc w:val="both"/>
-      </w:pPr>
-      <w:r>
-        <w:rPr>
-          <w:rFonts w:ascii="Times New Roman" w:hAnsi="Times New Roman" w:eastAsia="Times New Roman"/>
-          <w:b w:val="0"/>
-          <w:i w:val="0"/>
-          <w:sz w:val="28"/>
-        </w:rPr>
-        <w:t>межсайтовая подделка запросов (CSRF);</w:t>
-      </w:r>
-    </w:p>
-    <w:p>
-      <w:pPr>
-        <w:pStyle w:val="ListBullet"/>
-        <w:spacing w:after="60"/>
-        <w:ind w:firstLine="0"/>
-        <w:jc w:val="both"/>
-      </w:pPr>
-      <w:r>
-        <w:rPr>
-          <w:rFonts w:ascii="Times New Roman" w:hAnsi="Times New Roman" w:eastAsia="Times New Roman"/>
-          <w:b w:val="0"/>
-          <w:i w:val="0"/>
-          <w:sz w:val="28"/>
-        </w:rPr>
-        <w:t>недостаточное логирование и мониторинг событий безопасности;</w:t>
-      </w:r>
-    </w:p>
-    <w:p>
-      <w:pPr>
-        <w:pStyle w:val="ListBullet"/>
-        <w:spacing w:after="60"/>
-        <w:ind w:firstLine="0"/>
-        <w:jc w:val="both"/>
-      </w:pPr>
-      <w:r>
-        <w:rPr>
-          <w:rFonts w:ascii="Times New Roman" w:hAnsi="Times New Roman" w:eastAsia="Times New Roman"/>
-          <w:b w:val="0"/>
-          <w:i w:val="0"/>
-          <w:sz w:val="28"/>
-        </w:rPr>
-        <w:t>уязвимости сторонних компонентов и библиотек;</w:t>
-      </w:r>
-    </w:p>
-    <w:p>
-      <w:pPr>
-        <w:pStyle w:val="ListBullet"/>
-        <w:spacing w:after="60"/>
-        <w:ind w:firstLine="0"/>
-        <w:jc w:val="both"/>
-      </w:pPr>
-      <w:r>
-        <w:rPr>
-          <w:rFonts w:ascii="Times New Roman" w:hAnsi="Times New Roman" w:eastAsia="Times New Roman"/>
-          <w:b w:val="0"/>
-          <w:i w:val="0"/>
-          <w:sz w:val="28"/>
-        </w:rPr>
-        <w:t>уязвимости, приводящие к DoS/DDoS;</w:t>
-      </w:r>
-    </w:p>
-    <w:p>
-      <w:pPr>
-        <w:pStyle w:val="ListBullet"/>
-        <w:spacing w:after="60"/>
-        <w:ind w:firstLine="0"/>
-        <w:jc w:val="both"/>
-      </w:pPr>
-      <w:r>
-        <w:rPr>
-          <w:rFonts w:ascii="Times New Roman" w:hAnsi="Times New Roman" w:eastAsia="Times New Roman"/>
-          <w:b w:val="0"/>
-          <w:i w:val="0"/>
-          <w:sz w:val="28"/>
-        </w:rPr>
-        <w:t>небезопасная десериализация, path traversal и другие классы ошибок.</w:t>
-      </w:r>
-    </w:p>
-    <w:p>
-      <w:pPr>
-        <w:spacing w:before="240" w:after="160"/>
+        <w:spacing w:before="200" w:after="120"/>
         <w:ind w:firstLine="0"/>
         <w:jc w:val="left"/>
       </w:pPr>
@@ -3140,15 +1777,14 @@
         <w:rPr>
           <w:rFonts w:ascii="Times New Roman" w:hAnsi="Times New Roman" w:eastAsia="Times New Roman"/>
           <w:b/>
-          <w:i w:val="0"/>
           <w:sz w:val="28"/>
         </w:rPr>
-        <w:t>2. Регрессионное тестирование: понятие и назначение</w:t>
+        <w:t>2. Регрессионное тестирование</w:t>
       </w:r>
     </w:p>
     <w:p>
       <w:pPr>
-        <w:spacing w:after="120"/>
+        <w:spacing w:after="80"/>
         <w:ind w:firstLine="709"/>
         <w:jc w:val="both"/>
       </w:pPr>
@@ -3156,15 +1792,14 @@
         <w:rPr>
           <w:rFonts w:ascii="Times New Roman" w:hAnsi="Times New Roman" w:eastAsia="Times New Roman"/>
           <w:b w:val="0"/>
-          <w:i w:val="0"/>
           <w:sz w:val="28"/>
         </w:rPr>
-        <w:t>Регрессионное тестирование — повторное выполнение ранее пройденных тестов после внесения изменений в программное обеспечение (добавление новой функциональности, исправление дефекта, рефакторинг, обновление окружения или зависимостей) с целью убедиться, что ранее корректно работавшее поведение не нарушено.</w:t>
+        <w:t>Регрессионное тестирование — повторный прогон ранее пройденных тестов после изменений (новый функционал, фикс, рефакторинг), чтобы убедиться, что старое поведение не сломалось.</w:t>
       </w:r>
     </w:p>
     <w:p>
       <w:pPr>
-        <w:spacing w:after="120"/>
+        <w:spacing w:after="80"/>
         <w:ind w:firstLine="709"/>
         <w:jc w:val="both"/>
       </w:pPr>
@@ -3172,83 +1807,29 @@
         <w:rPr>
           <w:rFonts w:ascii="Times New Roman" w:hAnsi="Times New Roman" w:eastAsia="Times New Roman"/>
           <w:b w:val="0"/>
-          <w:i w:val="0"/>
           <w:sz w:val="28"/>
         </w:rPr>
-        <w:t>Назначение регрессионного тестирования:</w:t>
+        <w:t>Назначение: снизить риск побочных эффектов; подтвердить стабильность; база для автоматизации в CI. По охвату: полный, частичный, smoke/sanity.</w:t>
       </w:r>
     </w:p>
     <w:p>
       <w:pPr>
-        <w:pStyle w:val="ListBullet"/>
-        <w:spacing w:after="60"/>
+        <w:spacing w:before="200" w:after="120"/>
         <w:ind w:firstLine="0"/>
-        <w:jc w:val="both"/>
+        <w:jc w:val="left"/>
       </w:pPr>
       <w:r>
         <w:rPr>
           <w:rFonts w:ascii="Times New Roman" w:hAnsi="Times New Roman" w:eastAsia="Times New Roman"/>
-          <w:b w:val="0"/>
-          <w:i w:val="0"/>
+          <w:b/>
           <w:sz w:val="28"/>
         </w:rPr>
-        <w:t>снизить риск побочных эффектов изменений;</w:t>
+        <w:t>3. Источники и пути выявления требований. Уровни и типы</w:t>
       </w:r>
     </w:p>
     <w:p>
       <w:pPr>
-        <w:pStyle w:val="ListBullet"/>
-        <w:spacing w:after="60"/>
-        <w:ind w:firstLine="0"/>
-        <w:jc w:val="both"/>
-      </w:pPr>
-      <w:r>
-        <w:rPr>
-          <w:rFonts w:ascii="Times New Roman" w:hAnsi="Times New Roman" w:eastAsia="Times New Roman"/>
-          <w:b w:val="0"/>
-          <w:i w:val="0"/>
-          <w:sz w:val="28"/>
-        </w:rPr>
-        <w:t>подтвердить стабильность уже реализованных функций;</w:t>
-      </w:r>
-    </w:p>
-    <w:p>
-      <w:pPr>
-        <w:pStyle w:val="ListBullet"/>
-        <w:spacing w:after="60"/>
-        <w:ind w:firstLine="0"/>
-        <w:jc w:val="both"/>
-      </w:pPr>
-      <w:r>
-        <w:rPr>
-          <w:rFonts w:ascii="Times New Roman" w:hAnsi="Times New Roman" w:eastAsia="Times New Roman"/>
-          <w:b w:val="0"/>
-          <w:i w:val="0"/>
-          <w:sz w:val="28"/>
-        </w:rPr>
-        <w:t>обеспечить качество продукта при частых релизах и доработках;</w:t>
-      </w:r>
-    </w:p>
-    <w:p>
-      <w:pPr>
-        <w:pStyle w:val="ListBullet"/>
-        <w:spacing w:after="60"/>
-        <w:ind w:firstLine="0"/>
-        <w:jc w:val="both"/>
-      </w:pPr>
-      <w:r>
-        <w:rPr>
-          <w:rFonts w:ascii="Times New Roman" w:hAnsi="Times New Roman" w:eastAsia="Times New Roman"/>
-          <w:b w:val="0"/>
-          <w:i w:val="0"/>
-          <w:sz w:val="28"/>
-        </w:rPr>
-        <w:t>сформировать основу для автоматизации (регрессионный набор в CI/CD).</w:t>
-      </w:r>
-    </w:p>
-    <w:p>
-      <w:pPr>
-        <w:spacing w:after="120"/>
+        <w:spacing w:after="80"/>
         <w:ind w:firstLine="709"/>
         <w:jc w:val="both"/>
       </w:pPr>
@@ -3256,31 +1837,14 @@
         <w:rPr>
           <w:rFonts w:ascii="Times New Roman" w:hAnsi="Times New Roman" w:eastAsia="Times New Roman"/>
           <w:b w:val="0"/>
-          <w:i w:val="0"/>
           <w:sz w:val="28"/>
         </w:rPr>
-        <w:t>По охвату различают полный регресс, частичный регресс (по затронутым модулям и связанным областям), а также smoke/sanity как быстрый предварительный фильтр перед более полным регрессионным прогоном.</w:t>
+        <w:t>Источники: заказчик и пользователи; legacy-система; стандарты и законы; маркетинг/конкуренты; поддержка; аналитики и эксперты.</w:t>
       </w:r>
     </w:p>
     <w:p>
       <w:pPr>
-        <w:spacing w:before="240" w:after="160"/>
-        <w:ind w:firstLine="0"/>
-        <w:jc w:val="left"/>
-      </w:pPr>
-      <w:r>
-        <w:rPr>
-          <w:rFonts w:ascii="Times New Roman" w:hAnsi="Times New Roman" w:eastAsia="Times New Roman"/>
-          <w:b/>
-          <w:i w:val="0"/>
-          <w:sz w:val="28"/>
-        </w:rPr>
-        <w:t>3. Источники и пути выявления требований. Уровни и типы требований</w:t>
-      </w:r>
-    </w:p>
-    <w:p>
-      <w:pPr>
-        <w:spacing w:after="120"/>
+        <w:spacing w:after="80"/>
         <w:ind w:firstLine="709"/>
         <w:jc w:val="both"/>
       </w:pPr>
@@ -3288,117 +1852,14 @@
         <w:rPr>
           <w:rFonts w:ascii="Times New Roman" w:hAnsi="Times New Roman" w:eastAsia="Times New Roman"/>
           <w:b w:val="0"/>
-          <w:i w:val="0"/>
           <w:sz w:val="28"/>
         </w:rPr>
-        <w:t>Источники требований — лица, документы и системы, из которых получают информацию о том, что должно быть реализовано:</w:t>
+        <w:t>Пути выявления: интервью, опросы, workshops; наблюдение; анализ документов и прототипов; use case / user story; обратная связь по MVP.</w:t>
       </w:r>
     </w:p>
     <w:p>
       <w:pPr>
-        <w:pStyle w:val="ListBullet"/>
-        <w:spacing w:after="60"/>
-        <w:ind w:firstLine="0"/>
-        <w:jc w:val="both"/>
-      </w:pPr>
-      <w:r>
-        <w:rPr>
-          <w:rFonts w:ascii="Times New Roman" w:hAnsi="Times New Roman" w:eastAsia="Times New Roman"/>
-          <w:b w:val="0"/>
-          <w:i w:val="0"/>
-          <w:sz w:val="28"/>
-        </w:rPr>
-        <w:t>заказчик, бизнес-заказчик, конечные пользователи;</w:t>
-      </w:r>
-    </w:p>
-    <w:p>
-      <w:pPr>
-        <w:pStyle w:val="ListBullet"/>
-        <w:spacing w:after="60"/>
-        <w:ind w:firstLine="0"/>
-        <w:jc w:val="both"/>
-      </w:pPr>
-      <w:r>
-        <w:rPr>
-          <w:rFonts w:ascii="Times New Roman" w:hAnsi="Times New Roman" w:eastAsia="Times New Roman"/>
-          <w:b w:val="0"/>
-          <w:i w:val="0"/>
-          <w:sz w:val="28"/>
-        </w:rPr>
-        <w:t>действующее (legacy) программное обеспечение;</w:t>
-      </w:r>
-    </w:p>
-    <w:p>
-      <w:pPr>
-        <w:pStyle w:val="ListBullet"/>
-        <w:spacing w:after="60"/>
-        <w:ind w:firstLine="0"/>
-        <w:jc w:val="both"/>
-      </w:pPr>
-      <w:r>
-        <w:rPr>
-          <w:rFonts w:ascii="Times New Roman" w:hAnsi="Times New Roman" w:eastAsia="Times New Roman"/>
-          <w:b w:val="0"/>
-          <w:i w:val="0"/>
-          <w:sz w:val="28"/>
-        </w:rPr>
-        <w:t>стандарты, законы, отраслевые нормы и регламенты;</w:t>
-      </w:r>
-    </w:p>
-    <w:p>
-      <w:pPr>
-        <w:pStyle w:val="ListBullet"/>
-        <w:spacing w:after="60"/>
-        <w:ind w:firstLine="0"/>
-        <w:jc w:val="both"/>
-      </w:pPr>
-      <w:r>
-        <w:rPr>
-          <w:rFonts w:ascii="Times New Roman" w:hAnsi="Times New Roman" w:eastAsia="Times New Roman"/>
-          <w:b w:val="0"/>
-          <w:i w:val="0"/>
-          <w:sz w:val="28"/>
-        </w:rPr>
-        <w:t>маркетинг, анализ конкурентов и рынка;</w:t>
-      </w:r>
-    </w:p>
-    <w:p>
-      <w:pPr>
-        <w:pStyle w:val="ListBullet"/>
-        <w:spacing w:after="60"/>
-        <w:ind w:firstLine="0"/>
-        <w:jc w:val="both"/>
-      </w:pPr>
-      <w:r>
-        <w:rPr>
-          <w:rFonts w:ascii="Times New Roman" w:hAnsi="Times New Roman" w:eastAsia="Times New Roman"/>
-          <w:b w:val="0"/>
-          <w:i w:val="0"/>
-          <w:sz w:val="28"/>
-        </w:rPr>
-        <w:t>служба поддержки (тикеты, жалобы, обращения);</w:t>
-      </w:r>
-    </w:p>
-    <w:p>
-      <w:pPr>
-        <w:pStyle w:val="ListBullet"/>
-        <w:spacing w:after="60"/>
-        <w:ind w:firstLine="0"/>
-        <w:jc w:val="both"/>
-      </w:pPr>
-      <w:r>
-        <w:rPr>
-          <w:rFonts w:ascii="Times New Roman" w:hAnsi="Times New Roman" w:eastAsia="Times New Roman"/>
-          <w:b w:val="0"/>
-          <w:i w:val="0"/>
-          <w:sz w:val="28"/>
-        </w:rPr>
-        <w:t>архитекторы, аналитики, предметные эксперты.</w:t>
-      </w:r>
-    </w:p>
-    <w:p>
-      <w:pPr>
-        <w:spacing w:after="120"/>
+        <w:spacing w:after="80"/>
         <w:ind w:firstLine="709"/>
         <w:jc w:val="both"/>
       </w:pPr>
@@ -3406,117 +1867,14 @@
         <w:rPr>
           <w:rFonts w:ascii="Times New Roman" w:hAnsi="Times New Roman" w:eastAsia="Times New Roman"/>
           <w:b w:val="0"/>
-          <w:i w:val="0"/>
           <w:sz w:val="28"/>
         </w:rPr>
-        <w:t>Пути (методы) выявления требований:</w:t>
+        <w:t>Уровни: бизнес → пользовательские → системные (функциональные и нефункциональные).</w:t>
       </w:r>
     </w:p>
     <w:p>
       <w:pPr>
-        <w:pStyle w:val="ListBullet"/>
-        <w:spacing w:after="60"/>
-        <w:ind w:firstLine="0"/>
-        <w:jc w:val="both"/>
-      </w:pPr>
-      <w:r>
-        <w:rPr>
-          <w:rFonts w:ascii="Times New Roman" w:hAnsi="Times New Roman" w:eastAsia="Times New Roman"/>
-          <w:b w:val="0"/>
-          <w:i w:val="0"/>
-          <w:sz w:val="28"/>
-        </w:rPr>
-        <w:t>интервью, опросы, совместные семинары (workshops);</w:t>
-      </w:r>
-    </w:p>
-    <w:p>
-      <w:pPr>
-        <w:pStyle w:val="ListBullet"/>
-        <w:spacing w:after="60"/>
-        <w:ind w:firstLine="0"/>
-        <w:jc w:val="both"/>
-      </w:pPr>
-      <w:r>
-        <w:rPr>
-          <w:rFonts w:ascii="Times New Roman" w:hAnsi="Times New Roman" w:eastAsia="Times New Roman"/>
-          <w:b w:val="0"/>
-          <w:i w:val="0"/>
-          <w:sz w:val="28"/>
-        </w:rPr>
-        <w:t>наблюдение за работой пользователей;</w:t>
-      </w:r>
-    </w:p>
-    <w:p>
-      <w:pPr>
-        <w:pStyle w:val="ListBullet"/>
-        <w:spacing w:after="60"/>
-        <w:ind w:firstLine="0"/>
-        <w:jc w:val="both"/>
-      </w:pPr>
-      <w:r>
-        <w:rPr>
-          <w:rFonts w:ascii="Times New Roman" w:hAnsi="Times New Roman" w:eastAsia="Times New Roman"/>
-          <w:b w:val="0"/>
-          <w:i w:val="0"/>
-          <w:sz w:val="28"/>
-        </w:rPr>
-        <w:t>анализ документов и прототипов;</w:t>
-      </w:r>
-    </w:p>
-    <w:p>
-      <w:pPr>
-        <w:pStyle w:val="ListBullet"/>
-        <w:spacing w:after="60"/>
-        <w:ind w:firstLine="0"/>
-        <w:jc w:val="both"/>
-      </w:pPr>
-      <w:r>
-        <w:rPr>
-          <w:rFonts w:ascii="Times New Roman" w:hAnsi="Times New Roman" w:eastAsia="Times New Roman"/>
-          <w:b w:val="0"/>
-          <w:i w:val="0"/>
-          <w:sz w:val="28"/>
-        </w:rPr>
-        <w:t>построение use case, user story и сценариев использования;</w:t>
-      </w:r>
-    </w:p>
-    <w:p>
-      <w:pPr>
-        <w:pStyle w:val="ListBullet"/>
-        <w:spacing w:after="60"/>
-        <w:ind w:firstLine="0"/>
-        <w:jc w:val="both"/>
-      </w:pPr>
-      <w:r>
-        <w:rPr>
-          <w:rFonts w:ascii="Times New Roman" w:hAnsi="Times New Roman" w:eastAsia="Times New Roman"/>
-          <w:b w:val="0"/>
-          <w:i w:val="0"/>
-          <w:sz w:val="28"/>
-        </w:rPr>
-        <w:t>прототипирование и сбор обратной связи по MVP;</w:t>
-      </w:r>
-    </w:p>
-    <w:p>
-      <w:pPr>
-        <w:pStyle w:val="ListBullet"/>
-        <w:spacing w:after="60"/>
-        <w:ind w:firstLine="0"/>
-        <w:jc w:val="both"/>
-      </w:pPr>
-      <w:r>
-        <w:rPr>
-          <w:rFonts w:ascii="Times New Roman" w:hAnsi="Times New Roman" w:eastAsia="Times New Roman"/>
-          <w:b w:val="0"/>
-          <w:i w:val="0"/>
-          <w:sz w:val="28"/>
-        </w:rPr>
-        <w:t>анализ логов, метрик и фактического использования продукта.</w:t>
-      </w:r>
-    </w:p>
-    <w:p>
-      <w:pPr>
-        <w:spacing w:after="120"/>
+        <w:spacing w:after="80"/>
         <w:ind w:firstLine="709"/>
         <w:jc w:val="both"/>
       </w:pPr>
@@ -3524,208 +1882,19 @@
         <w:rPr>
           <w:rFonts w:ascii="Times New Roman" w:hAnsi="Times New Roman" w:eastAsia="Times New Roman"/>
           <w:b w:val="0"/>
-          <w:i w:val="0"/>
           <w:sz w:val="28"/>
         </w:rPr>
-        <w:t>Уровни требований:</w:t>
+        <w:t>Типы: функциональные; нефункциональные; бизнес-правила; ограничения; требования к данным/интерфейсам; переходные (миграция, обучение).</w:t>
       </w:r>
     </w:p>
     <w:p>
       <w:pPr>
-        <w:pStyle w:val="ListBullet"/>
-        <w:spacing w:after="60"/>
-        <w:ind w:firstLine="0"/>
-        <w:jc w:val="both"/>
+        <w:spacing w:before="360"/>
       </w:pPr>
       <w:r>
         <w:rPr>
           <w:rFonts w:ascii="Times New Roman" w:hAnsi="Times New Roman" w:eastAsia="Times New Roman"/>
           <w:b w:val="0"/>
-          <w:i w:val="0"/>
-          <w:sz w:val="28"/>
-        </w:rPr>
-        <w:t>бизнес-требования — цели и потребности организации;</w:t>
-      </w:r>
-    </w:p>
-    <w:p>
-      <w:pPr>
-        <w:pStyle w:val="ListBullet"/>
-        <w:spacing w:after="60"/>
-        <w:ind w:firstLine="0"/>
-        <w:jc w:val="both"/>
-      </w:pPr>
-      <w:r>
-        <w:rPr>
-          <w:rFonts w:ascii="Times New Roman" w:hAnsi="Times New Roman" w:eastAsia="Times New Roman"/>
-          <w:b w:val="0"/>
-          <w:i w:val="0"/>
-          <w:sz w:val="28"/>
-        </w:rPr>
-        <w:t>пользовательские требования — потребности конкретных ролей и пользователей;</w:t>
-      </w:r>
-    </w:p>
-    <w:p>
-      <w:pPr>
-        <w:pStyle w:val="ListBullet"/>
-        <w:spacing w:after="60"/>
-        <w:ind w:firstLine="0"/>
-        <w:jc w:val="both"/>
-      </w:pPr>
-      <w:r>
-        <w:rPr>
-          <w:rFonts w:ascii="Times New Roman" w:hAnsi="Times New Roman" w:eastAsia="Times New Roman"/>
-          <w:b w:val="0"/>
-          <w:i w:val="0"/>
-          <w:sz w:val="28"/>
-        </w:rPr>
-        <w:t>системные требования (функциональные и нефункциональные) — что и как должна делать система;</w:t>
-      </w:r>
-    </w:p>
-    <w:p>
-      <w:pPr>
-        <w:pStyle w:val="ListBullet"/>
-        <w:spacing w:after="60"/>
-        <w:ind w:firstLine="0"/>
-        <w:jc w:val="both"/>
-      </w:pPr>
-      <w:r>
-        <w:rPr>
-          <w:rFonts w:ascii="Times New Roman" w:hAnsi="Times New Roman" w:eastAsia="Times New Roman"/>
-          <w:b w:val="0"/>
-          <w:i w:val="0"/>
-          <w:sz w:val="28"/>
-        </w:rPr>
-        <w:t>требования к интерфейсам, данным и эксплуатации.</w:t>
-      </w:r>
-    </w:p>
-    <w:p>
-      <w:pPr>
-        <w:spacing w:after="120"/>
-        <w:ind w:firstLine="709"/>
-        <w:jc w:val="both"/>
-      </w:pPr>
-      <w:r>
-        <w:rPr>
-          <w:rFonts w:ascii="Times New Roman" w:hAnsi="Times New Roman" w:eastAsia="Times New Roman"/>
-          <w:b w:val="0"/>
-          <w:i w:val="0"/>
-          <w:sz w:val="28"/>
-        </w:rPr>
-        <w:t>Типы требований:</w:t>
-      </w:r>
-    </w:p>
-    <w:p>
-      <w:pPr>
-        <w:pStyle w:val="ListBullet"/>
-        <w:spacing w:after="60"/>
-        <w:ind w:firstLine="0"/>
-        <w:jc w:val="both"/>
-      </w:pPr>
-      <w:r>
-        <w:rPr>
-          <w:rFonts w:ascii="Times New Roman" w:hAnsi="Times New Roman" w:eastAsia="Times New Roman"/>
-          <w:b w:val="0"/>
-          <w:i w:val="0"/>
-          <w:sz w:val="28"/>
-        </w:rPr>
-        <w:t>функциональные — описывают функции и поведение системы;</w:t>
-      </w:r>
-    </w:p>
-    <w:p>
-      <w:pPr>
-        <w:pStyle w:val="ListBullet"/>
-        <w:spacing w:after="60"/>
-        <w:ind w:firstLine="0"/>
-        <w:jc w:val="both"/>
-      </w:pPr>
-      <w:r>
-        <w:rPr>
-          <w:rFonts w:ascii="Times New Roman" w:hAnsi="Times New Roman" w:eastAsia="Times New Roman"/>
-          <w:b w:val="0"/>
-          <w:i w:val="0"/>
-          <w:sz w:val="28"/>
-        </w:rPr>
-        <w:t>нефункциональные — производительность, безопасность, usability, надёжность и др.;</w:t>
-      </w:r>
-    </w:p>
-    <w:p>
-      <w:pPr>
-        <w:pStyle w:val="ListBullet"/>
-        <w:spacing w:after="60"/>
-        <w:ind w:firstLine="0"/>
-        <w:jc w:val="both"/>
-      </w:pPr>
-      <w:r>
-        <w:rPr>
-          <w:rFonts w:ascii="Times New Roman" w:hAnsi="Times New Roman" w:eastAsia="Times New Roman"/>
-          <w:b w:val="0"/>
-          <w:i w:val="0"/>
-          <w:sz w:val="28"/>
-        </w:rPr>
-        <w:t>бизнес-правила — ограничения и правила предметной области;</w:t>
-      </w:r>
-    </w:p>
-    <w:p>
-      <w:pPr>
-        <w:pStyle w:val="ListBullet"/>
-        <w:spacing w:after="60"/>
-        <w:ind w:firstLine="0"/>
-        <w:jc w:val="both"/>
-      </w:pPr>
-      <w:r>
-        <w:rPr>
-          <w:rFonts w:ascii="Times New Roman" w:hAnsi="Times New Roman" w:eastAsia="Times New Roman"/>
-          <w:b w:val="0"/>
-          <w:i w:val="0"/>
-          <w:sz w:val="28"/>
-        </w:rPr>
-        <w:t>ограничения — технологические, ресурсные, временные, бюджетные;</w:t>
-      </w:r>
-    </w:p>
-    <w:p>
-      <w:pPr>
-        <w:pStyle w:val="ListBullet"/>
-        <w:spacing w:after="60"/>
-        <w:ind w:firstLine="0"/>
-        <w:jc w:val="both"/>
-      </w:pPr>
-      <w:r>
-        <w:rPr>
-          <w:rFonts w:ascii="Times New Roman" w:hAnsi="Times New Roman" w:eastAsia="Times New Roman"/>
-          <w:b w:val="0"/>
-          <w:i w:val="0"/>
-          <w:sz w:val="28"/>
-        </w:rPr>
-        <w:t>требования к данным и интерфейсам;</w:t>
-      </w:r>
-    </w:p>
-    <w:p>
-      <w:pPr>
-        <w:pStyle w:val="ListBullet"/>
-        <w:spacing w:after="60"/>
-        <w:ind w:firstLine="0"/>
-        <w:jc w:val="both"/>
-      </w:pPr>
-      <w:r>
-        <w:rPr>
-          <w:rFonts w:ascii="Times New Roman" w:hAnsi="Times New Roman" w:eastAsia="Times New Roman"/>
-          <w:b w:val="0"/>
-          <w:i w:val="0"/>
-          <w:sz w:val="28"/>
-        </w:rPr>
-        <w:t>переходные требования — миграция, обучение, ввод в эксплуатацию.</w:t>
-      </w:r>
-    </w:p>
-    <w:p/>
-    <w:p>
-      <w:pPr>
-        <w:spacing w:before="480"/>
-      </w:pPr>
-      <w:r>
-        <w:rPr>
-          <w:rFonts w:ascii="Times New Roman" w:hAnsi="Times New Roman" w:eastAsia="Times New Roman"/>
-          <w:b w:val="0"/>
-          <w:i w:val="0"/>
           <w:sz w:val="28"/>
         </w:rPr>
         <w:t>Преподаватель: П.Д. Баркун</w:t>
@@ -4105,7 +2274,7 @@
     <w:qFormat/>
     <w:rsid w:val="00FC693F"/>
     <w:pPr>
-      <w:spacing w:line="276" w:lineRule="auto" w:after="120"/>
+      <w:spacing w:line="276" w:lineRule="auto" w:after="80"/>
     </w:pPr>
     <w:rPr>
       <w:rFonts w:ascii="Times New Roman" w:hAnsi="Times New Roman" w:eastAsia="Times New Roman"/>

</xml_diff>